<commit_message>
Make Unit 10 Speaking Task Card 5 scenario concrete
Card 5 ("Two Different Answers") gave no actual conflicting details,
unlike Cards 1-4 which anchor the call in one specific fact (a room
change, a time change). Added a concrete 5:00pm vs 5:30pm conflict
so students have something to react to instead of inventing a topic
before they can start practicing the decision step.

Co-Authored-By: Claude Sonnet 5 <noreply@anthropic.com>
</commit_message>
<xml_diff>
--- a/_deliverables/MICE-Unit10-Speaking-Task-Cards.docx
+++ b/_deliverables/MICE-Unit10-Speaking-Task-Cards.docx
@@ -47,12 +47,6 @@
         <w:gridCol w:w="3480"/>
       </w:tblGrid>
       <w:tr>
-        <w:tblPrEx>
-          <w:tblCellMar>
-            <w:top w:w="0" w:type="dxa"/>
-            <w:bottom w:w="0" w:type="dxa"/>
-          </w:tblCellMar>
-        </w:tblPrEx>
         <w:tc>
           <w:tcPr>
             <w:tcW w:w="1650" w:type="pct"/>
@@ -74,8 +68,34 @@
                 <w:sz w:val="17"/>
                 <w:szCs w:val="17"/>
               </w:rPr>
-              <w:t>Student A</w:t>
-            </w:r>
+              <w:t xml:space="preserve">Student A Name (Caller)</w:t>
+            </w:r>
+          </w:p>
+          <w:p>
+            <w:pPr>
+              <w:pBdr>
+                <w:bottom w:val="single" w:sz="6" w:space="1" w:color="000000"/>
+              </w:pBdr>
+            </w:pPr>
+            <w:r>
+              <w:t xml:space="preserve"> </w:t>
+            </w:r>
+          </w:p>
+        </w:tc>
+        <w:tc>
+          <w:tcPr>
+            <w:tcW w:w="1650" w:type="pct"/>
+            <w:tcMar>
+              <w:top w:w="30" w:type="dxa"/>
+              <w:left w:w="0" w:type="dxa"/>
+              <w:bottom w:w="100" w:type="dxa"/>
+              <w:right w:w="160" w:type="dxa"/>
+            </w:tcMar>
+          </w:tcPr>
+          <w:p>
+            <w:pPr>
+              <w:spacing w:after="20"/>
+            </w:pPr>
             <w:r>
               <w:rPr>
                 <w:b/>
@@ -83,8 +103,34 @@
                 <w:sz w:val="17"/>
                 <w:szCs w:val="17"/>
               </w:rPr>
-              <w:t xml:space="preserve"> Name</w:t>
-            </w:r>
+              <w:t xml:space="preserve">Student B Name (Information Desk)</w:t>
+            </w:r>
+          </w:p>
+          <w:p>
+            <w:pPr>
+              <w:pBdr>
+                <w:bottom w:val="single" w:sz="6" w:space="1" w:color="000000"/>
+              </w:pBdr>
+            </w:pPr>
+            <w:r>
+              <w:t xml:space="preserve"> </w:t>
+            </w:r>
+          </w:p>
+        </w:tc>
+        <w:tc>
+          <w:tcPr>
+            <w:tcW w:w="1650" w:type="pct"/>
+            <w:tcMar>
+              <w:top w:w="30" w:type="dxa"/>
+              <w:left w:w="0" w:type="dxa"/>
+              <w:bottom w:w="100" w:type="dxa"/>
+              <w:right w:w="160" w:type="dxa"/>
+            </w:tcMar>
+          </w:tcPr>
+          <w:p>
+            <w:pPr>
+              <w:spacing w:after="20"/>
+            </w:pPr>
             <w:r>
               <w:rPr>
                 <w:b/>
@@ -92,7 +138,7 @@
                 <w:sz w:val="17"/>
                 <w:szCs w:val="17"/>
               </w:rPr>
-              <w:t xml:space="preserve"> (Caller)</w:t>
+              <w:t>Date:</w:t>
             </w:r>
           </w:p>
           <w:p>
@@ -106,94 +152,6 @@
             </w:r>
           </w:p>
         </w:tc>
-        <w:tc>
-          <w:tcPr>
-            <w:tcW w:w="1650" w:type="pct"/>
-            <w:tcMar>
-              <w:top w:w="30" w:type="dxa"/>
-              <w:left w:w="0" w:type="dxa"/>
-              <w:bottom w:w="100" w:type="dxa"/>
-              <w:right w:w="160" w:type="dxa"/>
-            </w:tcMar>
-          </w:tcPr>
-          <w:p>
-            <w:pPr>
-              <w:spacing w:after="20"/>
-            </w:pPr>
-            <w:r>
-              <w:rPr>
-                <w:b/>
-                <w:bCs/>
-                <w:sz w:val="17"/>
-                <w:szCs w:val="17"/>
-              </w:rPr>
-              <w:t xml:space="preserve">Student B </w:t>
-            </w:r>
-            <w:r>
-              <w:rPr>
-                <w:b/>
-                <w:bCs/>
-                <w:sz w:val="17"/>
-                <w:szCs w:val="17"/>
-              </w:rPr>
-              <w:t xml:space="preserve">Name </w:t>
-            </w:r>
-            <w:r>
-              <w:rPr>
-                <w:b/>
-                <w:bCs/>
-                <w:sz w:val="17"/>
-                <w:szCs w:val="17"/>
-              </w:rPr>
-              <w:t>(Information Desk)</w:t>
-            </w:r>
-          </w:p>
-          <w:p>
-            <w:pPr>
-              <w:pBdr>
-                <w:bottom w:val="single" w:sz="6" w:space="1" w:color="000000"/>
-              </w:pBdr>
-            </w:pPr>
-            <w:r>
-              <w:t xml:space="preserve"> </w:t>
-            </w:r>
-          </w:p>
-        </w:tc>
-        <w:tc>
-          <w:tcPr>
-            <w:tcW w:w="1650" w:type="pct"/>
-            <w:tcMar>
-              <w:top w:w="30" w:type="dxa"/>
-              <w:left w:w="0" w:type="dxa"/>
-              <w:bottom w:w="100" w:type="dxa"/>
-              <w:right w:w="160" w:type="dxa"/>
-            </w:tcMar>
-          </w:tcPr>
-          <w:p>
-            <w:pPr>
-              <w:spacing w:after="20"/>
-            </w:pPr>
-            <w:r>
-              <w:rPr>
-                <w:b/>
-                <w:bCs/>
-                <w:sz w:val="17"/>
-                <w:szCs w:val="17"/>
-              </w:rPr>
-              <w:t>Date:</w:t>
-            </w:r>
-          </w:p>
-          <w:p>
-            <w:pPr>
-              <w:pBdr>
-                <w:bottom w:val="single" w:sz="6" w:space="1" w:color="000000"/>
-              </w:pBdr>
-            </w:pPr>
-            <w:r>
-              <w:t xml:space="preserve"> </w:t>
-            </w:r>
-          </w:p>
-        </w:tc>
       </w:tr>
     </w:tbl>
     <w:p>
@@ -201,7 +159,7 @@
         <w:spacing w:before="40" w:after="100"/>
       </w:pPr>
       <w:r>
-        <w:t>Student A is the caller. Student B is Information Desk staff. Read the scenario below, write your script together using all 7 steps, then record a video of your call and send it to the class group chat.</w:t>
+        <w:t xml:space="preserve">Student A is the caller. Student B is Information Desk staff. Read the scenario below, create a script together using all 7 steps, then record a video of your call and send it to the class group chat.</w:t>
       </w:r>
     </w:p>
     <w:p>
@@ -235,12 +193,6 @@
         <w:gridCol w:w="5220"/>
       </w:tblGrid>
       <w:tr>
-        <w:tblPrEx>
-          <w:tblCellMar>
-            <w:top w:w="0" w:type="dxa"/>
-            <w:bottom w:w="0" w:type="dxa"/>
-          </w:tblCellMar>
-        </w:tblPrEx>
         <w:tc>
           <w:tcPr>
             <w:tcW w:w="2500" w:type="pct"/>
@@ -283,12 +235,6 @@
         </w:tc>
       </w:tr>
       <w:tr>
-        <w:tblPrEx>
-          <w:tblCellMar>
-            <w:top w:w="0" w:type="dxa"/>
-            <w:bottom w:w="0" w:type="dxa"/>
-          </w:tblCellMar>
-        </w:tblPrEx>
         <w:tc>
           <w:tcPr>
             <w:tcW w:w="2500" w:type="pct"/>
@@ -331,12 +277,6 @@
         </w:tc>
       </w:tr>
       <w:tr>
-        <w:tblPrEx>
-          <w:tblCellMar>
-            <w:top w:w="0" w:type="dxa"/>
-            <w:bottom w:w="0" w:type="dxa"/>
-          </w:tblCellMar>
-        </w:tblPrEx>
         <w:tc>
           <w:tcPr>
             <w:tcW w:w="2500" w:type="pct"/>
@@ -379,12 +319,6 @@
         </w:tc>
       </w:tr>
       <w:tr>
-        <w:tblPrEx>
-          <w:tblCellMar>
-            <w:top w:w="0" w:type="dxa"/>
-            <w:bottom w:w="0" w:type="dxa"/>
-          </w:tblCellMar>
-        </w:tblPrEx>
         <w:tc>
           <w:tcPr>
             <w:tcW w:w="2500" w:type="pct"/>
@@ -450,12 +384,6 @@
         <w:gridCol w:w="7830"/>
       </w:tblGrid>
       <w:tr>
-        <w:tblPrEx>
-          <w:tblCellMar>
-            <w:top w:w="0" w:type="dxa"/>
-            <w:bottom w:w="0" w:type="dxa"/>
-          </w:tblCellMar>
-        </w:tblPrEx>
         <w:tc>
           <w:tcPr>
             <w:tcW w:w="2400" w:type="dxa"/>
@@ -568,25 +496,7 @@
           <w:sz w:val="19"/>
           <w:szCs w:val="19"/>
         </w:rPr>
-        <w:t>Write your script below</w:t>
-      </w:r>
-      <w:r>
-        <w:rPr>
-          <w:i/>
-          <w:iCs/>
-          <w:sz w:val="19"/>
-          <w:szCs w:val="19"/>
-        </w:rPr>
-        <w:t xml:space="preserve"> (optional)</w:t>
-      </w:r>
-      <w:r>
-        <w:rPr>
-          <w:i/>
-          <w:iCs/>
-          <w:sz w:val="19"/>
-          <w:szCs w:val="19"/>
-        </w:rPr>
-        <w:t>.</w:t>
+        <w:t xml:space="preserve">Write your script below (optional).</w:t>
       </w:r>
     </w:p>
     <w:p>
@@ -750,12 +660,6 @@
         <w:gridCol w:w="3480"/>
       </w:tblGrid>
       <w:tr>
-        <w:tblPrEx>
-          <w:tblCellMar>
-            <w:top w:w="0" w:type="dxa"/>
-            <w:bottom w:w="0" w:type="dxa"/>
-          </w:tblCellMar>
-        </w:tblPrEx>
         <w:tc>
           <w:tcPr>
             <w:tcW w:w="1650" w:type="pct"/>
@@ -777,7 +681,7 @@
                 <w:sz w:val="17"/>
                 <w:szCs w:val="17"/>
               </w:rPr>
-              <w:t>Student A (Caller)</w:t>
+              <w:t>Student A Name (Caller)</w:t>
             </w:r>
           </w:p>
           <w:p>
@@ -812,7 +716,7 @@
                 <w:sz w:val="17"/>
                 <w:szCs w:val="17"/>
               </w:rPr>
-              <w:t>Student B (Information Desk)</w:t>
+              <w:t>Student B Name (Information Desk)</w:t>
             </w:r>
           </w:p>
           <w:p>
@@ -847,7 +751,7 @@
                 <w:sz w:val="17"/>
                 <w:szCs w:val="17"/>
               </w:rPr>
-              <w:t>Group</w:t>
+              <w:t>Date:</w:t>
             </w:r>
           </w:p>
           <w:p>
@@ -868,7 +772,7 @@
         <w:spacing w:before="40" w:after="100"/>
       </w:pPr>
       <w:r>
-        <w:t>Student A is the caller. Student B is Information Desk staff. Read the scenario below, write your script together using all 7 steps, then record a video of your call and send it to the class group chat.</w:t>
+        <w:t xml:space="preserve">Student A is the caller. Student B is Information Desk staff. Read the scenario below, create a script together using all 7 steps, then record a video of your call and send it to the class group chat.</w:t>
       </w:r>
     </w:p>
     <w:p>
@@ -902,12 +806,6 @@
         <w:gridCol w:w="5220"/>
       </w:tblGrid>
       <w:tr>
-        <w:tblPrEx>
-          <w:tblCellMar>
-            <w:top w:w="0" w:type="dxa"/>
-            <w:bottom w:w="0" w:type="dxa"/>
-          </w:tblCellMar>
-        </w:tblPrEx>
         <w:tc>
           <w:tcPr>
             <w:tcW w:w="2500" w:type="pct"/>
@@ -950,12 +848,6 @@
         </w:tc>
       </w:tr>
       <w:tr>
-        <w:tblPrEx>
-          <w:tblCellMar>
-            <w:top w:w="0" w:type="dxa"/>
-            <w:bottom w:w="0" w:type="dxa"/>
-          </w:tblCellMar>
-        </w:tblPrEx>
         <w:tc>
           <w:tcPr>
             <w:tcW w:w="2500" w:type="pct"/>
@@ -998,12 +890,6 @@
         </w:tc>
       </w:tr>
       <w:tr>
-        <w:tblPrEx>
-          <w:tblCellMar>
-            <w:top w:w="0" w:type="dxa"/>
-            <w:bottom w:w="0" w:type="dxa"/>
-          </w:tblCellMar>
-        </w:tblPrEx>
         <w:tc>
           <w:tcPr>
             <w:tcW w:w="2500" w:type="pct"/>
@@ -1046,12 +932,6 @@
         </w:tc>
       </w:tr>
       <w:tr>
-        <w:tblPrEx>
-          <w:tblCellMar>
-            <w:top w:w="0" w:type="dxa"/>
-            <w:bottom w:w="0" w:type="dxa"/>
-          </w:tblCellMar>
-        </w:tblPrEx>
         <w:tc>
           <w:tcPr>
             <w:tcW w:w="2500" w:type="pct"/>
@@ -1117,12 +997,6 @@
         <w:gridCol w:w="7830"/>
       </w:tblGrid>
       <w:tr>
-        <w:tblPrEx>
-          <w:tblCellMar>
-            <w:top w:w="0" w:type="dxa"/>
-            <w:bottom w:w="0" w:type="dxa"/>
-          </w:tblCellMar>
-        </w:tblPrEx>
         <w:tc>
           <w:tcPr>
             <w:tcW w:w="2400" w:type="dxa"/>
@@ -1235,25 +1109,7 @@
           <w:sz w:val="19"/>
           <w:szCs w:val="19"/>
         </w:rPr>
-        <w:t>Write your script below</w:t>
-      </w:r>
-      <w:r>
-        <w:rPr>
-          <w:i/>
-          <w:iCs/>
-          <w:sz w:val="19"/>
-          <w:szCs w:val="19"/>
-        </w:rPr>
-        <w:t xml:space="preserve"> (optional)</w:t>
-      </w:r>
-      <w:r>
-        <w:rPr>
-          <w:i/>
-          <w:iCs/>
-          <w:sz w:val="19"/>
-          <w:szCs w:val="19"/>
-        </w:rPr>
-        <w:t>.</w:t>
+        <w:t xml:space="preserve">Write your script below (optional).</w:t>
       </w:r>
     </w:p>
     <w:p>
@@ -1417,12 +1273,6 @@
         <w:gridCol w:w="3480"/>
       </w:tblGrid>
       <w:tr>
-        <w:tblPrEx>
-          <w:tblCellMar>
-            <w:top w:w="0" w:type="dxa"/>
-            <w:bottom w:w="0" w:type="dxa"/>
-          </w:tblCellMar>
-        </w:tblPrEx>
         <w:tc>
           <w:tcPr>
             <w:tcW w:w="1650" w:type="pct"/>
@@ -1444,7 +1294,7 @@
                 <w:sz w:val="17"/>
                 <w:szCs w:val="17"/>
               </w:rPr>
-              <w:t>Student A (Caller)</w:t>
+              <w:t>Student A Name (Caller)</w:t>
             </w:r>
           </w:p>
           <w:p>
@@ -1479,7 +1329,7 @@
                 <w:sz w:val="17"/>
                 <w:szCs w:val="17"/>
               </w:rPr>
-              <w:t>Student B (Information Desk)</w:t>
+              <w:t>Student B Name (Information Desk)</w:t>
             </w:r>
           </w:p>
           <w:p>
@@ -1514,7 +1364,7 @@
                 <w:sz w:val="17"/>
                 <w:szCs w:val="17"/>
               </w:rPr>
-              <w:t>Group</w:t>
+              <w:t xml:space="preserve">Date: </w:t>
             </w:r>
           </w:p>
           <w:p>
@@ -1535,7 +1385,7 @@
         <w:spacing w:before="40" w:after="100"/>
       </w:pPr>
       <w:r>
-        <w:t>Student A is the caller. Student B is Information Desk staff. Read the scenario below, write your script together using all 7 steps, then record a video of your call and send it to the class group chat.</w:t>
+        <w:t xml:space="preserve">Student A is the caller. Student B is Information Desk staff. Read the scenario below, create a script together using all 7 steps, then record a video of your call and send it to the class group chat.</w:t>
       </w:r>
     </w:p>
     <w:p>
@@ -1569,12 +1419,6 @@
         <w:gridCol w:w="5220"/>
       </w:tblGrid>
       <w:tr>
-        <w:tblPrEx>
-          <w:tblCellMar>
-            <w:top w:w="0" w:type="dxa"/>
-            <w:bottom w:w="0" w:type="dxa"/>
-          </w:tblCellMar>
-        </w:tblPrEx>
         <w:tc>
           <w:tcPr>
             <w:tcW w:w="2500" w:type="pct"/>
@@ -1617,12 +1461,6 @@
         </w:tc>
       </w:tr>
       <w:tr>
-        <w:tblPrEx>
-          <w:tblCellMar>
-            <w:top w:w="0" w:type="dxa"/>
-            <w:bottom w:w="0" w:type="dxa"/>
-          </w:tblCellMar>
-        </w:tblPrEx>
         <w:tc>
           <w:tcPr>
             <w:tcW w:w="2500" w:type="pct"/>
@@ -1665,12 +1503,6 @@
         </w:tc>
       </w:tr>
       <w:tr>
-        <w:tblPrEx>
-          <w:tblCellMar>
-            <w:top w:w="0" w:type="dxa"/>
-            <w:bottom w:w="0" w:type="dxa"/>
-          </w:tblCellMar>
-        </w:tblPrEx>
         <w:tc>
           <w:tcPr>
             <w:tcW w:w="2500" w:type="pct"/>
@@ -1713,12 +1545,6 @@
         </w:tc>
       </w:tr>
       <w:tr>
-        <w:tblPrEx>
-          <w:tblCellMar>
-            <w:top w:w="0" w:type="dxa"/>
-            <w:bottom w:w="0" w:type="dxa"/>
-          </w:tblCellMar>
-        </w:tblPrEx>
         <w:tc>
           <w:tcPr>
             <w:tcW w:w="2500" w:type="pct"/>
@@ -1784,12 +1610,6 @@
         <w:gridCol w:w="7830"/>
       </w:tblGrid>
       <w:tr>
-        <w:tblPrEx>
-          <w:tblCellMar>
-            <w:top w:w="0" w:type="dxa"/>
-            <w:bottom w:w="0" w:type="dxa"/>
-          </w:tblCellMar>
-        </w:tblPrEx>
         <w:tc>
           <w:tcPr>
             <w:tcW w:w="2610" w:type="dxa"/>
@@ -2066,12 +1886,6 @@
         <w:gridCol w:w="3480"/>
       </w:tblGrid>
       <w:tr>
-        <w:tblPrEx>
-          <w:tblCellMar>
-            <w:top w:w="0" w:type="dxa"/>
-            <w:bottom w:w="0" w:type="dxa"/>
-          </w:tblCellMar>
-        </w:tblPrEx>
         <w:tc>
           <w:tcPr>
             <w:tcW w:w="1650" w:type="pct"/>
@@ -2093,7 +1907,7 @@
                 <w:sz w:val="17"/>
                 <w:szCs w:val="17"/>
               </w:rPr>
-              <w:t>Student A (Caller)</w:t>
+              <w:t>Student A Name (Caller)</w:t>
             </w:r>
           </w:p>
           <w:p>
@@ -2128,7 +1942,7 @@
                 <w:sz w:val="17"/>
                 <w:szCs w:val="17"/>
               </w:rPr>
-              <w:t>Student B (Information Desk)</w:t>
+              <w:t>Student B Name (Information Desk)</w:t>
             </w:r>
           </w:p>
           <w:p>
@@ -2163,7 +1977,7 @@
                 <w:sz w:val="17"/>
                 <w:szCs w:val="17"/>
               </w:rPr>
-              <w:t>Group</w:t>
+              <w:t>Date:</w:t>
             </w:r>
           </w:p>
           <w:p>
@@ -2184,7 +1998,7 @@
         <w:spacing w:before="40" w:after="100"/>
       </w:pPr>
       <w:r>
-        <w:t>Student A is the caller. Student B is Information Desk staff. Read the scenario below, write your script together using all 7 steps, then record a video of your call and send it to the class group chat.</w:t>
+        <w:t xml:space="preserve">Student A is the caller. Student B is Information Desk staff. Read the scenario below, create a script together using all 7 steps, then record a video of your call and send it to the class group chat.</w:t>
       </w:r>
     </w:p>
     <w:p>
@@ -2218,12 +2032,6 @@
         <w:gridCol w:w="5220"/>
       </w:tblGrid>
       <w:tr>
-        <w:tblPrEx>
-          <w:tblCellMar>
-            <w:top w:w="0" w:type="dxa"/>
-            <w:bottom w:w="0" w:type="dxa"/>
-          </w:tblCellMar>
-        </w:tblPrEx>
         <w:tc>
           <w:tcPr>
             <w:tcW w:w="2500" w:type="pct"/>
@@ -2266,12 +2074,6 @@
         </w:tc>
       </w:tr>
       <w:tr>
-        <w:tblPrEx>
-          <w:tblCellMar>
-            <w:top w:w="0" w:type="dxa"/>
-            <w:bottom w:w="0" w:type="dxa"/>
-          </w:tblCellMar>
-        </w:tblPrEx>
         <w:tc>
           <w:tcPr>
             <w:tcW w:w="2500" w:type="pct"/>
@@ -2314,12 +2116,6 @@
         </w:tc>
       </w:tr>
       <w:tr>
-        <w:tblPrEx>
-          <w:tblCellMar>
-            <w:top w:w="0" w:type="dxa"/>
-            <w:bottom w:w="0" w:type="dxa"/>
-          </w:tblCellMar>
-        </w:tblPrEx>
         <w:tc>
           <w:tcPr>
             <w:tcW w:w="2500" w:type="pct"/>
@@ -2362,12 +2158,6 @@
         </w:tc>
       </w:tr>
       <w:tr>
-        <w:tblPrEx>
-          <w:tblCellMar>
-            <w:top w:w="0" w:type="dxa"/>
-            <w:bottom w:w="0" w:type="dxa"/>
-          </w:tblCellMar>
-        </w:tblPrEx>
         <w:tc>
           <w:tcPr>
             <w:tcW w:w="2500" w:type="pct"/>
@@ -2433,12 +2223,6 @@
         <w:gridCol w:w="7830"/>
       </w:tblGrid>
       <w:tr>
-        <w:tblPrEx>
-          <w:tblCellMar>
-            <w:top w:w="0" w:type="dxa"/>
-            <w:bottom w:w="0" w:type="dxa"/>
-          </w:tblCellMar>
-        </w:tblPrEx>
         <w:tc>
           <w:tcPr>
             <w:tcW w:w="2610" w:type="dxa"/>
@@ -2715,12 +2499,6 @@
         <w:gridCol w:w="3480"/>
       </w:tblGrid>
       <w:tr>
-        <w:tblPrEx>
-          <w:tblCellMar>
-            <w:top w:w="0" w:type="dxa"/>
-            <w:bottom w:w="0" w:type="dxa"/>
-          </w:tblCellMar>
-        </w:tblPrEx>
         <w:tc>
           <w:tcPr>
             <w:tcW w:w="1650" w:type="pct"/>
@@ -2742,7 +2520,7 @@
                 <w:sz w:val="17"/>
                 <w:szCs w:val="17"/>
               </w:rPr>
-              <w:t>Student A (Caller)</w:t>
+              <w:t>Student A Name (Caller)</w:t>
             </w:r>
           </w:p>
           <w:p>
@@ -2777,7 +2555,7 @@
                 <w:sz w:val="17"/>
                 <w:szCs w:val="17"/>
               </w:rPr>
-              <w:t>Student B (Information Desk)</w:t>
+              <w:t>Student B Name (Information Desk)</w:t>
             </w:r>
           </w:p>
           <w:p>
@@ -2812,7 +2590,7 @@
                 <w:sz w:val="17"/>
                 <w:szCs w:val="17"/>
               </w:rPr>
-              <w:t>Group</w:t>
+              <w:t>Date:</w:t>
             </w:r>
           </w:p>
           <w:p>
@@ -2833,7 +2611,7 @@
         <w:spacing w:before="40" w:after="100"/>
       </w:pPr>
       <w:r>
-        <w:t>Student A is the caller. Student B is Information Desk staff. Read the scenario below, write your script together using all 7 steps, then record a video of your call and send it to the class group chat.</w:t>
+        <w:t xml:space="preserve">Student A is the caller. Student B is Information Desk staff. Read the scenario below, create a script together using all 7 steps, then record a video of your call and send it to the class group chat.</w:t>
       </w:r>
     </w:p>
     <w:p>
@@ -2867,12 +2645,6 @@
         <w:gridCol w:w="5220"/>
       </w:tblGrid>
       <w:tr>
-        <w:tblPrEx>
-          <w:tblCellMar>
-            <w:top w:w="0" w:type="dxa"/>
-            <w:bottom w:w="0" w:type="dxa"/>
-          </w:tblCellMar>
-        </w:tblPrEx>
         <w:tc>
           <w:tcPr>
             <w:tcW w:w="2500" w:type="pct"/>
@@ -2915,12 +2687,6 @@
         </w:tc>
       </w:tr>
       <w:tr>
-        <w:tblPrEx>
-          <w:tblCellMar>
-            <w:top w:w="0" w:type="dxa"/>
-            <w:bottom w:w="0" w:type="dxa"/>
-          </w:tblCellMar>
-        </w:tblPrEx>
         <w:tc>
           <w:tcPr>
             <w:tcW w:w="2500" w:type="pct"/>
@@ -2963,12 +2729,6 @@
         </w:tc>
       </w:tr>
       <w:tr>
-        <w:tblPrEx>
-          <w:tblCellMar>
-            <w:top w:w="0" w:type="dxa"/>
-            <w:bottom w:w="0" w:type="dxa"/>
-          </w:tblCellMar>
-        </w:tblPrEx>
         <w:tc>
           <w:tcPr>
             <w:tcW w:w="2500" w:type="pct"/>
@@ -3011,12 +2771,6 @@
         </w:tc>
       </w:tr>
       <w:tr>
-        <w:tblPrEx>
-          <w:tblCellMar>
-            <w:top w:w="0" w:type="dxa"/>
-            <w:bottom w:w="0" w:type="dxa"/>
-          </w:tblCellMar>
-        </w:tblPrEx>
         <w:tc>
           <w:tcPr>
             <w:tcW w:w="2500" w:type="pct"/>
@@ -3082,12 +2836,6 @@
         <w:gridCol w:w="7830"/>
       </w:tblGrid>
       <w:tr>
-        <w:tblPrEx>
-          <w:tblCellMar>
-            <w:top w:w="0" w:type="dxa"/>
-            <w:bottom w:w="0" w:type="dxa"/>
-          </w:tblCellMar>
-        </w:tblPrEx>
         <w:tc>
           <w:tcPr>
             <w:tcW w:w="2400" w:type="dxa"/>
@@ -3174,7 +2922,7 @@
                 <w:sz w:val="19"/>
                 <w:szCs w:val="19"/>
               </w:rPr>
-              <w:t>"The phone rings. One of your colleagues told me something different on the phone earlier. Who's right?"</w:t>
+              <w:t>"The phone rings. One of your colleagues told me the closing ceremony starts at 5pm, but someone else said 5:30. Which is right?"</w:t>
             </w:r>
           </w:p>
           <w:p>
@@ -3183,7 +2931,7 @@
                 <w:sz w:val="19"/>
                 <w:szCs w:val="19"/>
               </w:rPr>
-              <w:t>Two staff members gave different information. It's not your job to guess who's right.</w:t>
+              <w:t>One staff member said 5:00pm, another said 5:30pm. It's not your job to guess who's right, check before you answer.</w:t>
             </w:r>
           </w:p>
         </w:tc>
@@ -3364,12 +3112,6 @@
         <w:gridCol w:w="3480"/>
       </w:tblGrid>
       <w:tr>
-        <w:tblPrEx>
-          <w:tblCellMar>
-            <w:top w:w="0" w:type="dxa"/>
-            <w:bottom w:w="0" w:type="dxa"/>
-          </w:tblCellMar>
-        </w:tblPrEx>
         <w:tc>
           <w:tcPr>
             <w:tcW w:w="1650" w:type="pct"/>
@@ -3391,7 +3133,7 @@
                 <w:sz w:val="17"/>
                 <w:szCs w:val="17"/>
               </w:rPr>
-              <w:t>Student A (Caller)</w:t>
+              <w:t>Student A Name (Caller)</w:t>
             </w:r>
           </w:p>
           <w:p>
@@ -3426,7 +3168,7 @@
                 <w:sz w:val="17"/>
                 <w:szCs w:val="17"/>
               </w:rPr>
-              <w:t>Student B (Information Desk)</w:t>
+              <w:t>Student B Name (Information Desk)</w:t>
             </w:r>
           </w:p>
           <w:p>
@@ -3461,7 +3203,7 @@
                 <w:sz w:val="17"/>
                 <w:szCs w:val="17"/>
               </w:rPr>
-              <w:t>Group</w:t>
+              <w:t>Date:</w:t>
             </w:r>
           </w:p>
           <w:p>
@@ -3482,7 +3224,7 @@
         <w:spacing w:before="40" w:after="100"/>
       </w:pPr>
       <w:r>
-        <w:t>Student A is the caller. Student B is Information Desk staff. Read the scenario below, write your script together using all 7 steps, then record a video of your call and send it to the class group chat.</w:t>
+        <w:t xml:space="preserve">Student A is the caller. Student B is Information Desk staff. Read the scenario below, create a script together using all 7 steps, then record a video of your call and send it to the class group chat.</w:t>
       </w:r>
     </w:p>
     <w:p>
@@ -3516,12 +3258,6 @@
         <w:gridCol w:w="5220"/>
       </w:tblGrid>
       <w:tr>
-        <w:tblPrEx>
-          <w:tblCellMar>
-            <w:top w:w="0" w:type="dxa"/>
-            <w:bottom w:w="0" w:type="dxa"/>
-          </w:tblCellMar>
-        </w:tblPrEx>
         <w:tc>
           <w:tcPr>
             <w:tcW w:w="2500" w:type="pct"/>
@@ -3564,12 +3300,6 @@
         </w:tc>
       </w:tr>
       <w:tr>
-        <w:tblPrEx>
-          <w:tblCellMar>
-            <w:top w:w="0" w:type="dxa"/>
-            <w:bottom w:w="0" w:type="dxa"/>
-          </w:tblCellMar>
-        </w:tblPrEx>
         <w:tc>
           <w:tcPr>
             <w:tcW w:w="2500" w:type="pct"/>
@@ -3612,12 +3342,6 @@
         </w:tc>
       </w:tr>
       <w:tr>
-        <w:tblPrEx>
-          <w:tblCellMar>
-            <w:top w:w="0" w:type="dxa"/>
-            <w:bottom w:w="0" w:type="dxa"/>
-          </w:tblCellMar>
-        </w:tblPrEx>
         <w:tc>
           <w:tcPr>
             <w:tcW w:w="2500" w:type="pct"/>
@@ -3660,12 +3384,6 @@
         </w:tc>
       </w:tr>
       <w:tr>
-        <w:tblPrEx>
-          <w:tblCellMar>
-            <w:top w:w="0" w:type="dxa"/>
-            <w:bottom w:w="0" w:type="dxa"/>
-          </w:tblCellMar>
-        </w:tblPrEx>
         <w:tc>
           <w:tcPr>
             <w:tcW w:w="2500" w:type="pct"/>
@@ -3731,12 +3449,6 @@
         <w:gridCol w:w="7830"/>
       </w:tblGrid>
       <w:tr>
-        <w:tblPrEx>
-          <w:tblCellMar>
-            <w:top w:w="0" w:type="dxa"/>
-            <w:bottom w:w="0" w:type="dxa"/>
-          </w:tblCellMar>
-        </w:tblPrEx>
         <w:tc>
           <w:tcPr>
             <w:tcW w:w="2400" w:type="dxa"/>
@@ -4028,12 +3740,6 @@
         <w:gridCol w:w="3480"/>
       </w:tblGrid>
       <w:tr>
-        <w:tblPrEx>
-          <w:tblCellMar>
-            <w:top w:w="0" w:type="dxa"/>
-            <w:bottom w:w="0" w:type="dxa"/>
-          </w:tblCellMar>
-        </w:tblPrEx>
         <w:tc>
           <w:tcPr>
             <w:tcW w:w="1650" w:type="pct"/>
@@ -4055,7 +3761,7 @@
                 <w:sz w:val="17"/>
                 <w:szCs w:val="17"/>
               </w:rPr>
-              <w:t>Student A (Caller)</w:t>
+              <w:t>Student A Name (Caller)</w:t>
             </w:r>
           </w:p>
           <w:p>
@@ -4090,7 +3796,7 @@
                 <w:sz w:val="17"/>
                 <w:szCs w:val="17"/>
               </w:rPr>
-              <w:t>Student B (Information Desk)</w:t>
+              <w:t>Student B Name (Information Desk)</w:t>
             </w:r>
           </w:p>
           <w:p>
@@ -4125,7 +3831,7 @@
                 <w:sz w:val="17"/>
                 <w:szCs w:val="17"/>
               </w:rPr>
-              <w:t>Group</w:t>
+              <w:t>Date:</w:t>
             </w:r>
           </w:p>
           <w:p>
@@ -4146,7 +3852,7 @@
         <w:spacing w:before="40" w:after="100"/>
       </w:pPr>
       <w:r>
-        <w:t>Student A is the caller. Student B is Information Desk staff. Read the scenario below, write your script together using all 7 steps, then record a video of your call and send it to the class group chat.</w:t>
+        <w:t xml:space="preserve">Student A is the caller. Student B is Information Desk staff. Read the scenario below, create a script together using all 7 steps, then record a video of your call and send it to the class group chat.</w:t>
       </w:r>
     </w:p>
     <w:p>
@@ -4180,12 +3886,6 @@
         <w:gridCol w:w="5220"/>
       </w:tblGrid>
       <w:tr>
-        <w:tblPrEx>
-          <w:tblCellMar>
-            <w:top w:w="0" w:type="dxa"/>
-            <w:bottom w:w="0" w:type="dxa"/>
-          </w:tblCellMar>
-        </w:tblPrEx>
         <w:tc>
           <w:tcPr>
             <w:tcW w:w="2500" w:type="pct"/>
@@ -4228,12 +3928,6 @@
         </w:tc>
       </w:tr>
       <w:tr>
-        <w:tblPrEx>
-          <w:tblCellMar>
-            <w:top w:w="0" w:type="dxa"/>
-            <w:bottom w:w="0" w:type="dxa"/>
-          </w:tblCellMar>
-        </w:tblPrEx>
         <w:tc>
           <w:tcPr>
             <w:tcW w:w="2500" w:type="pct"/>
@@ -4276,12 +3970,6 @@
         </w:tc>
       </w:tr>
       <w:tr>
-        <w:tblPrEx>
-          <w:tblCellMar>
-            <w:top w:w="0" w:type="dxa"/>
-            <w:bottom w:w="0" w:type="dxa"/>
-          </w:tblCellMar>
-        </w:tblPrEx>
         <w:tc>
           <w:tcPr>
             <w:tcW w:w="2500" w:type="pct"/>
@@ -4324,12 +4012,6 @@
         </w:tc>
       </w:tr>
       <w:tr>
-        <w:tblPrEx>
-          <w:tblCellMar>
-            <w:top w:w="0" w:type="dxa"/>
-            <w:bottom w:w="0" w:type="dxa"/>
-          </w:tblCellMar>
-        </w:tblPrEx>
         <w:tc>
           <w:tcPr>
             <w:tcW w:w="2500" w:type="pct"/>
@@ -4395,12 +4077,6 @@
         <w:gridCol w:w="7830"/>
       </w:tblGrid>
       <w:tr>
-        <w:tblPrEx>
-          <w:tblCellMar>
-            <w:top w:w="0" w:type="dxa"/>
-            <w:bottom w:w="0" w:type="dxa"/>
-          </w:tblCellMar>
-        </w:tblPrEx>
         <w:tc>
           <w:tcPr>
             <w:tcW w:w="2400" w:type="dxa"/>
@@ -4677,12 +4353,6 @@
         <w:gridCol w:w="3480"/>
       </w:tblGrid>
       <w:tr>
-        <w:tblPrEx>
-          <w:tblCellMar>
-            <w:top w:w="0" w:type="dxa"/>
-            <w:bottom w:w="0" w:type="dxa"/>
-          </w:tblCellMar>
-        </w:tblPrEx>
         <w:tc>
           <w:tcPr>
             <w:tcW w:w="1650" w:type="pct"/>
@@ -4704,7 +4374,7 @@
                 <w:sz w:val="17"/>
                 <w:szCs w:val="17"/>
               </w:rPr>
-              <w:t>Student A (Caller)</w:t>
+              <w:t>Student A Name (Caller)</w:t>
             </w:r>
           </w:p>
           <w:p>
@@ -4739,7 +4409,7 @@
                 <w:sz w:val="17"/>
                 <w:szCs w:val="17"/>
               </w:rPr>
-              <w:t>Student B (Information Desk)</w:t>
+              <w:t>Student B Name (Information Desk)</w:t>
             </w:r>
           </w:p>
           <w:p>
@@ -4774,7 +4444,7 @@
                 <w:sz w:val="17"/>
                 <w:szCs w:val="17"/>
               </w:rPr>
-              <w:t>Group</w:t>
+              <w:t>Date:</w:t>
             </w:r>
           </w:p>
           <w:p>
@@ -4795,7 +4465,7 @@
         <w:spacing w:before="40" w:after="100"/>
       </w:pPr>
       <w:r>
-        <w:t>Student A is the caller. Student B is Information Desk staff. Read the scenario below, write your script together using all 7 steps, then record a video of your call and send it to the class group chat.</w:t>
+        <w:t xml:space="preserve">Student A is the caller. Student B is Information Desk staff. Read the scenario below, create a script together using all 7 steps, then record a video of your call and send it to the class group chat.</w:t>
       </w:r>
     </w:p>
     <w:p>
@@ -4829,12 +4499,6 @@
         <w:gridCol w:w="5220"/>
       </w:tblGrid>
       <w:tr>
-        <w:tblPrEx>
-          <w:tblCellMar>
-            <w:top w:w="0" w:type="dxa"/>
-            <w:bottom w:w="0" w:type="dxa"/>
-          </w:tblCellMar>
-        </w:tblPrEx>
         <w:tc>
           <w:tcPr>
             <w:tcW w:w="2500" w:type="pct"/>
@@ -4877,12 +4541,6 @@
         </w:tc>
       </w:tr>
       <w:tr>
-        <w:tblPrEx>
-          <w:tblCellMar>
-            <w:top w:w="0" w:type="dxa"/>
-            <w:bottom w:w="0" w:type="dxa"/>
-          </w:tblCellMar>
-        </w:tblPrEx>
         <w:tc>
           <w:tcPr>
             <w:tcW w:w="2500" w:type="pct"/>
@@ -4925,12 +4583,6 @@
         </w:tc>
       </w:tr>
       <w:tr>
-        <w:tblPrEx>
-          <w:tblCellMar>
-            <w:top w:w="0" w:type="dxa"/>
-            <w:bottom w:w="0" w:type="dxa"/>
-          </w:tblCellMar>
-        </w:tblPrEx>
         <w:tc>
           <w:tcPr>
             <w:tcW w:w="2500" w:type="pct"/>
@@ -4973,12 +4625,6 @@
         </w:tc>
       </w:tr>
       <w:tr>
-        <w:tblPrEx>
-          <w:tblCellMar>
-            <w:top w:w="0" w:type="dxa"/>
-            <w:bottom w:w="0" w:type="dxa"/>
-          </w:tblCellMar>
-        </w:tblPrEx>
         <w:tc>
           <w:tcPr>
             <w:tcW w:w="2500" w:type="pct"/>
@@ -5044,12 +4690,6 @@
         <w:gridCol w:w="7830"/>
       </w:tblGrid>
       <w:tr>
-        <w:tblPrEx>
-          <w:tblCellMar>
-            <w:top w:w="0" w:type="dxa"/>
-            <w:bottom w:w="0" w:type="dxa"/>
-          </w:tblCellMar>
-        </w:tblPrEx>
         <w:tc>
           <w:tcPr>
             <w:tcW w:w="2400" w:type="dxa"/>
@@ -5326,12 +4966,6 @@
         <w:gridCol w:w="3480"/>
       </w:tblGrid>
       <w:tr>
-        <w:tblPrEx>
-          <w:tblCellMar>
-            <w:top w:w="0" w:type="dxa"/>
-            <w:bottom w:w="0" w:type="dxa"/>
-          </w:tblCellMar>
-        </w:tblPrEx>
         <w:tc>
           <w:tcPr>
             <w:tcW w:w="1650" w:type="pct"/>
@@ -5353,7 +4987,7 @@
                 <w:sz w:val="17"/>
                 <w:szCs w:val="17"/>
               </w:rPr>
-              <w:t>Student A (Caller)</w:t>
+              <w:t>Student A Name (Caller)</w:t>
             </w:r>
           </w:p>
           <w:p>
@@ -5388,7 +5022,7 @@
                 <w:sz w:val="17"/>
                 <w:szCs w:val="17"/>
               </w:rPr>
-              <w:t>Student B (Information Desk)</w:t>
+              <w:t>Student B Name (Information Desk)</w:t>
             </w:r>
           </w:p>
           <w:p>
@@ -5423,7 +5057,7 @@
                 <w:sz w:val="17"/>
                 <w:szCs w:val="17"/>
               </w:rPr>
-              <w:t>Group</w:t>
+              <w:t>Date:</w:t>
             </w:r>
           </w:p>
           <w:p>
@@ -5444,7 +5078,7 @@
         <w:spacing w:before="40" w:after="100"/>
       </w:pPr>
       <w:r>
-        <w:t>Student A is the caller. Student B is Information Desk staff. Read the scenario below, write your script together using all 7 steps, then record a video of your call and send it to the class group chat.</w:t>
+        <w:t xml:space="preserve">Student A is the caller. Student B is Information Desk staff. Read the scenario below, create a script together using all 7 steps, then record a video of your call and send it to the class group chat.</w:t>
       </w:r>
     </w:p>
     <w:p>
@@ -5478,12 +5112,6 @@
         <w:gridCol w:w="5220"/>
       </w:tblGrid>
       <w:tr>
-        <w:tblPrEx>
-          <w:tblCellMar>
-            <w:top w:w="0" w:type="dxa"/>
-            <w:bottom w:w="0" w:type="dxa"/>
-          </w:tblCellMar>
-        </w:tblPrEx>
         <w:tc>
           <w:tcPr>
             <w:tcW w:w="2500" w:type="pct"/>
@@ -5526,12 +5154,6 @@
         </w:tc>
       </w:tr>
       <w:tr>
-        <w:tblPrEx>
-          <w:tblCellMar>
-            <w:top w:w="0" w:type="dxa"/>
-            <w:bottom w:w="0" w:type="dxa"/>
-          </w:tblCellMar>
-        </w:tblPrEx>
         <w:tc>
           <w:tcPr>
             <w:tcW w:w="2500" w:type="pct"/>
@@ -5574,12 +5196,6 @@
         </w:tc>
       </w:tr>
       <w:tr>
-        <w:tblPrEx>
-          <w:tblCellMar>
-            <w:top w:w="0" w:type="dxa"/>
-            <w:bottom w:w="0" w:type="dxa"/>
-          </w:tblCellMar>
-        </w:tblPrEx>
         <w:tc>
           <w:tcPr>
             <w:tcW w:w="2500" w:type="pct"/>
@@ -5622,12 +5238,6 @@
         </w:tc>
       </w:tr>
       <w:tr>
-        <w:tblPrEx>
-          <w:tblCellMar>
-            <w:top w:w="0" w:type="dxa"/>
-            <w:bottom w:w="0" w:type="dxa"/>
-          </w:tblCellMar>
-        </w:tblPrEx>
         <w:tc>
           <w:tcPr>
             <w:tcW w:w="2500" w:type="pct"/>
@@ -5693,12 +5303,6 @@
         <w:gridCol w:w="7830"/>
       </w:tblGrid>
       <w:tr>
-        <w:tblPrEx>
-          <w:tblCellMar>
-            <w:top w:w="0" w:type="dxa"/>
-            <w:bottom w:w="0" w:type="dxa"/>
-          </w:tblCellMar>
-        </w:tblPrEx>
         <w:tc>
           <w:tcPr>
             <w:tcW w:w="2400" w:type="dxa"/>
@@ -5990,12 +5594,6 @@
         <w:gridCol w:w="3480"/>
       </w:tblGrid>
       <w:tr>
-        <w:tblPrEx>
-          <w:tblCellMar>
-            <w:top w:w="0" w:type="dxa"/>
-            <w:bottom w:w="0" w:type="dxa"/>
-          </w:tblCellMar>
-        </w:tblPrEx>
         <w:tc>
           <w:tcPr>
             <w:tcW w:w="1650" w:type="pct"/>
@@ -6017,7 +5615,7 @@
                 <w:sz w:val="17"/>
                 <w:szCs w:val="17"/>
               </w:rPr>
-              <w:t>Student A (Caller)</w:t>
+              <w:t>Student A Name (Caller)</w:t>
             </w:r>
           </w:p>
           <w:p>
@@ -6052,7 +5650,7 @@
                 <w:sz w:val="17"/>
                 <w:szCs w:val="17"/>
               </w:rPr>
-              <w:t>Student B (Information Desk)</w:t>
+              <w:t>Student B Name (Information Desk)</w:t>
             </w:r>
           </w:p>
           <w:p>
@@ -6087,7 +5685,7 @@
                 <w:sz w:val="17"/>
                 <w:szCs w:val="17"/>
               </w:rPr>
-              <w:t>Group</w:t>
+              <w:t>Date:</w:t>
             </w:r>
           </w:p>
           <w:p>
@@ -6108,7 +5706,7 @@
         <w:spacing w:before="40" w:after="100"/>
       </w:pPr>
       <w:r>
-        <w:t>Student A is the caller. Student B is Information Desk staff. Read the scenario below, write your script together using all 7 steps, then record a video of your call and send it to the class group chat.</w:t>
+        <w:t xml:space="preserve">Student A is the caller. Student B is Information Desk staff. Read the scenario below, create a script together using all 7 steps, then record a video of your call and send it to the class group chat.</w:t>
       </w:r>
     </w:p>
     <w:p>
@@ -6142,12 +5740,6 @@
         <w:gridCol w:w="5220"/>
       </w:tblGrid>
       <w:tr>
-        <w:tblPrEx>
-          <w:tblCellMar>
-            <w:top w:w="0" w:type="dxa"/>
-            <w:bottom w:w="0" w:type="dxa"/>
-          </w:tblCellMar>
-        </w:tblPrEx>
         <w:tc>
           <w:tcPr>
             <w:tcW w:w="2500" w:type="pct"/>
@@ -6190,12 +5782,6 @@
         </w:tc>
       </w:tr>
       <w:tr>
-        <w:tblPrEx>
-          <w:tblCellMar>
-            <w:top w:w="0" w:type="dxa"/>
-            <w:bottom w:w="0" w:type="dxa"/>
-          </w:tblCellMar>
-        </w:tblPrEx>
         <w:tc>
           <w:tcPr>
             <w:tcW w:w="2500" w:type="pct"/>
@@ -6238,12 +5824,6 @@
         </w:tc>
       </w:tr>
       <w:tr>
-        <w:tblPrEx>
-          <w:tblCellMar>
-            <w:top w:w="0" w:type="dxa"/>
-            <w:bottom w:w="0" w:type="dxa"/>
-          </w:tblCellMar>
-        </w:tblPrEx>
         <w:tc>
           <w:tcPr>
             <w:tcW w:w="2500" w:type="pct"/>
@@ -6286,12 +5866,6 @@
         </w:tc>
       </w:tr>
       <w:tr>
-        <w:tblPrEx>
-          <w:tblCellMar>
-            <w:top w:w="0" w:type="dxa"/>
-            <w:bottom w:w="0" w:type="dxa"/>
-          </w:tblCellMar>
-        </w:tblPrEx>
         <w:tc>
           <w:tcPr>
             <w:tcW w:w="2500" w:type="pct"/>
@@ -6357,12 +5931,6 @@
         <w:gridCol w:w="7830"/>
       </w:tblGrid>
       <w:tr>
-        <w:tblPrEx>
-          <w:tblCellMar>
-            <w:top w:w="0" w:type="dxa"/>
-            <w:bottom w:w="0" w:type="dxa"/>
-          </w:tblCellMar>
-        </w:tblPrEx>
         <w:tc>
           <w:tcPr>
             <w:tcW w:w="2400" w:type="dxa"/>
@@ -6654,12 +6222,6 @@
         <w:gridCol w:w="3480"/>
       </w:tblGrid>
       <w:tr>
-        <w:tblPrEx>
-          <w:tblCellMar>
-            <w:top w:w="0" w:type="dxa"/>
-            <w:bottom w:w="0" w:type="dxa"/>
-          </w:tblCellMar>
-        </w:tblPrEx>
         <w:tc>
           <w:tcPr>
             <w:tcW w:w="1650" w:type="pct"/>
@@ -6681,7 +6243,7 @@
                 <w:sz w:val="17"/>
                 <w:szCs w:val="17"/>
               </w:rPr>
-              <w:t>Student A (Caller)</w:t>
+              <w:t>Student A Name (Caller)</w:t>
             </w:r>
           </w:p>
           <w:p>
@@ -6716,7 +6278,7 @@
                 <w:sz w:val="17"/>
                 <w:szCs w:val="17"/>
               </w:rPr>
-              <w:t>Student B (Information Desk)</w:t>
+              <w:t>Student B Name (Information Desk)</w:t>
             </w:r>
           </w:p>
           <w:p>
@@ -6751,7 +6313,7 @@
                 <w:sz w:val="17"/>
                 <w:szCs w:val="17"/>
               </w:rPr>
-              <w:t>Group</w:t>
+              <w:t>Date:</w:t>
             </w:r>
           </w:p>
           <w:p>
@@ -6772,7 +6334,7 @@
         <w:spacing w:before="40" w:after="100"/>
       </w:pPr>
       <w:r>
-        <w:t>Student A is the caller. Student B is Information Desk staff. Read the scenario below, write your script together using all 7 steps, then record a video of your call and send it to the class group chat.</w:t>
+        <w:t xml:space="preserve">Student A is the caller. Student B is Information Desk staff. Read the scenario below, create a script together using all 7 steps, then record a video of your call and send it to the class group chat.</w:t>
       </w:r>
     </w:p>
     <w:p>
@@ -6806,12 +6368,6 @@
         <w:gridCol w:w="5220"/>
       </w:tblGrid>
       <w:tr>
-        <w:tblPrEx>
-          <w:tblCellMar>
-            <w:top w:w="0" w:type="dxa"/>
-            <w:bottom w:w="0" w:type="dxa"/>
-          </w:tblCellMar>
-        </w:tblPrEx>
         <w:tc>
           <w:tcPr>
             <w:tcW w:w="2500" w:type="pct"/>
@@ -6854,12 +6410,6 @@
         </w:tc>
       </w:tr>
       <w:tr>
-        <w:tblPrEx>
-          <w:tblCellMar>
-            <w:top w:w="0" w:type="dxa"/>
-            <w:bottom w:w="0" w:type="dxa"/>
-          </w:tblCellMar>
-        </w:tblPrEx>
         <w:tc>
           <w:tcPr>
             <w:tcW w:w="2500" w:type="pct"/>
@@ -6902,12 +6452,6 @@
         </w:tc>
       </w:tr>
       <w:tr>
-        <w:tblPrEx>
-          <w:tblCellMar>
-            <w:top w:w="0" w:type="dxa"/>
-            <w:bottom w:w="0" w:type="dxa"/>
-          </w:tblCellMar>
-        </w:tblPrEx>
         <w:tc>
           <w:tcPr>
             <w:tcW w:w="2500" w:type="pct"/>
@@ -6950,12 +6494,6 @@
         </w:tc>
       </w:tr>
       <w:tr>
-        <w:tblPrEx>
-          <w:tblCellMar>
-            <w:top w:w="0" w:type="dxa"/>
-            <w:bottom w:w="0" w:type="dxa"/>
-          </w:tblCellMar>
-        </w:tblPrEx>
         <w:tc>
           <w:tcPr>
             <w:tcW w:w="2500" w:type="pct"/>
@@ -7021,12 +6559,6 @@
         <w:gridCol w:w="7830"/>
       </w:tblGrid>
       <w:tr>
-        <w:tblPrEx>
-          <w:tblCellMar>
-            <w:top w:w="0" w:type="dxa"/>
-            <w:bottom w:w="0" w:type="dxa"/>
-          </w:tblCellMar>
-        </w:tblPrEx>
         <w:tc>
           <w:tcPr>
             <w:tcW w:w="2400" w:type="dxa"/>
@@ -7318,12 +6850,6 @@
         <w:gridCol w:w="3480"/>
       </w:tblGrid>
       <w:tr>
-        <w:tblPrEx>
-          <w:tblCellMar>
-            <w:top w:w="0" w:type="dxa"/>
-            <w:bottom w:w="0" w:type="dxa"/>
-          </w:tblCellMar>
-        </w:tblPrEx>
         <w:tc>
           <w:tcPr>
             <w:tcW w:w="1650" w:type="pct"/>
@@ -7345,7 +6871,7 @@
                 <w:sz w:val="17"/>
                 <w:szCs w:val="17"/>
               </w:rPr>
-              <w:t>Student A (Caller)</w:t>
+              <w:t>Student A Name (Caller)</w:t>
             </w:r>
           </w:p>
           <w:p>
@@ -7380,7 +6906,7 @@
                 <w:sz w:val="17"/>
                 <w:szCs w:val="17"/>
               </w:rPr>
-              <w:t>Student B (Information Desk)</w:t>
+              <w:t>Student B Name (Information Desk)</w:t>
             </w:r>
           </w:p>
           <w:p>
@@ -7415,7 +6941,7 @@
                 <w:sz w:val="17"/>
                 <w:szCs w:val="17"/>
               </w:rPr>
-              <w:t>Group</w:t>
+              <w:t>Date:</w:t>
             </w:r>
           </w:p>
           <w:p>
@@ -7436,7 +6962,7 @@
         <w:spacing w:before="40" w:after="100"/>
       </w:pPr>
       <w:r>
-        <w:t>Student A is the caller. Student B is Information Desk staff. Read the scenario below, write your script together using all 7 steps, then record a video of your call and send it to the class group chat.</w:t>
+        <w:t xml:space="preserve">Student A is the caller. Student B is Information Desk staff. Read the scenario below, create a script together using all 7 steps, then record a video of your call and send it to the class group chat.</w:t>
       </w:r>
     </w:p>
     <w:p>
@@ -7470,12 +6996,6 @@
         <w:gridCol w:w="5220"/>
       </w:tblGrid>
       <w:tr>
-        <w:tblPrEx>
-          <w:tblCellMar>
-            <w:top w:w="0" w:type="dxa"/>
-            <w:bottom w:w="0" w:type="dxa"/>
-          </w:tblCellMar>
-        </w:tblPrEx>
         <w:tc>
           <w:tcPr>
             <w:tcW w:w="2500" w:type="pct"/>
@@ -7518,12 +7038,6 @@
         </w:tc>
       </w:tr>
       <w:tr>
-        <w:tblPrEx>
-          <w:tblCellMar>
-            <w:top w:w="0" w:type="dxa"/>
-            <w:bottom w:w="0" w:type="dxa"/>
-          </w:tblCellMar>
-        </w:tblPrEx>
         <w:tc>
           <w:tcPr>
             <w:tcW w:w="2500" w:type="pct"/>
@@ -7566,12 +7080,6 @@
         </w:tc>
       </w:tr>
       <w:tr>
-        <w:tblPrEx>
-          <w:tblCellMar>
-            <w:top w:w="0" w:type="dxa"/>
-            <w:bottom w:w="0" w:type="dxa"/>
-          </w:tblCellMar>
-        </w:tblPrEx>
         <w:tc>
           <w:tcPr>
             <w:tcW w:w="2500" w:type="pct"/>
@@ -7614,12 +7122,6 @@
         </w:tc>
       </w:tr>
       <w:tr>
-        <w:tblPrEx>
-          <w:tblCellMar>
-            <w:top w:w="0" w:type="dxa"/>
-            <w:bottom w:w="0" w:type="dxa"/>
-          </w:tblCellMar>
-        </w:tblPrEx>
         <w:tc>
           <w:tcPr>
             <w:tcW w:w="2500" w:type="pct"/>
@@ -7685,12 +7187,6 @@
         <w:gridCol w:w="7830"/>
       </w:tblGrid>
       <w:tr>
-        <w:tblPrEx>
-          <w:tblCellMar>
-            <w:top w:w="0" w:type="dxa"/>
-            <w:bottom w:w="0" w:type="dxa"/>
-          </w:tblCellMar>
-        </w:tblPrEx>
         <w:tc>
           <w:tcPr>
             <w:tcW w:w="2400" w:type="dxa"/>
@@ -7982,12 +7478,6 @@
         <w:gridCol w:w="3480"/>
       </w:tblGrid>
       <w:tr>
-        <w:tblPrEx>
-          <w:tblCellMar>
-            <w:top w:w="0" w:type="dxa"/>
-            <w:bottom w:w="0" w:type="dxa"/>
-          </w:tblCellMar>
-        </w:tblPrEx>
         <w:tc>
           <w:tcPr>
             <w:tcW w:w="1650" w:type="pct"/>
@@ -8009,7 +7499,7 @@
                 <w:sz w:val="17"/>
                 <w:szCs w:val="17"/>
               </w:rPr>
-              <w:t>Student A (Caller)</w:t>
+              <w:t>Student A Name (Caller)</w:t>
             </w:r>
           </w:p>
           <w:p>
@@ -8044,7 +7534,7 @@
                 <w:sz w:val="17"/>
                 <w:szCs w:val="17"/>
               </w:rPr>
-              <w:t>Student B (Information Desk)</w:t>
+              <w:t>Student B Name (Information Desk)</w:t>
             </w:r>
           </w:p>
           <w:p>
@@ -8079,7 +7569,7 @@
                 <w:sz w:val="17"/>
                 <w:szCs w:val="17"/>
               </w:rPr>
-              <w:t>Group</w:t>
+              <w:t>Date:</w:t>
             </w:r>
           </w:p>
           <w:p>
@@ -8100,7 +7590,7 @@
         <w:spacing w:before="40" w:after="100"/>
       </w:pPr>
       <w:r>
-        <w:t>Student A is the caller. Student B is Information Desk staff. Read the scenario below, write your script together using all 7 steps, then record a video of your call and send it to the class group chat.</w:t>
+        <w:t xml:space="preserve">Student A is the caller. Student B is Information Desk staff. Read the scenario below, create a script together using all 7 steps, then record a video of your call and send it to the class group chat.</w:t>
       </w:r>
     </w:p>
     <w:p>
@@ -8134,12 +7624,6 @@
         <w:gridCol w:w="5220"/>
       </w:tblGrid>
       <w:tr>
-        <w:tblPrEx>
-          <w:tblCellMar>
-            <w:top w:w="0" w:type="dxa"/>
-            <w:bottom w:w="0" w:type="dxa"/>
-          </w:tblCellMar>
-        </w:tblPrEx>
         <w:tc>
           <w:tcPr>
             <w:tcW w:w="2500" w:type="pct"/>
@@ -8182,12 +7666,6 @@
         </w:tc>
       </w:tr>
       <w:tr>
-        <w:tblPrEx>
-          <w:tblCellMar>
-            <w:top w:w="0" w:type="dxa"/>
-            <w:bottom w:w="0" w:type="dxa"/>
-          </w:tblCellMar>
-        </w:tblPrEx>
         <w:tc>
           <w:tcPr>
             <w:tcW w:w="2500" w:type="pct"/>
@@ -8230,12 +7708,6 @@
         </w:tc>
       </w:tr>
       <w:tr>
-        <w:tblPrEx>
-          <w:tblCellMar>
-            <w:top w:w="0" w:type="dxa"/>
-            <w:bottom w:w="0" w:type="dxa"/>
-          </w:tblCellMar>
-        </w:tblPrEx>
         <w:tc>
           <w:tcPr>
             <w:tcW w:w="2500" w:type="pct"/>
@@ -8278,12 +7750,6 @@
         </w:tc>
       </w:tr>
       <w:tr>
-        <w:tblPrEx>
-          <w:tblCellMar>
-            <w:top w:w="0" w:type="dxa"/>
-            <w:bottom w:w="0" w:type="dxa"/>
-          </w:tblCellMar>
-        </w:tblPrEx>
         <w:tc>
           <w:tcPr>
             <w:tcW w:w="2500" w:type="pct"/>
@@ -8349,12 +7815,6 @@
         <w:gridCol w:w="7830"/>
       </w:tblGrid>
       <w:tr>
-        <w:tblPrEx>
-          <w:tblCellMar>
-            <w:top w:w="0" w:type="dxa"/>
-            <w:bottom w:w="0" w:type="dxa"/>
-          </w:tblCellMar>
-        </w:tblPrEx>
         <w:tc>
           <w:tcPr>
             <w:tcW w:w="2400" w:type="dxa"/>
@@ -8631,12 +8091,6 @@
         <w:gridCol w:w="3480"/>
       </w:tblGrid>
       <w:tr>
-        <w:tblPrEx>
-          <w:tblCellMar>
-            <w:top w:w="0" w:type="dxa"/>
-            <w:bottom w:w="0" w:type="dxa"/>
-          </w:tblCellMar>
-        </w:tblPrEx>
         <w:tc>
           <w:tcPr>
             <w:tcW w:w="1650" w:type="pct"/>
@@ -8658,7 +8112,7 @@
                 <w:sz w:val="17"/>
                 <w:szCs w:val="17"/>
               </w:rPr>
-              <w:t>Student A (Caller)</w:t>
+              <w:t>Student A Name (Caller)</w:t>
             </w:r>
           </w:p>
           <w:p>
@@ -8693,7 +8147,7 @@
                 <w:sz w:val="17"/>
                 <w:szCs w:val="17"/>
               </w:rPr>
-              <w:t>Student B (Information Desk)</w:t>
+              <w:t>Student B Name (Information Desk)</w:t>
             </w:r>
           </w:p>
           <w:p>
@@ -8728,7 +8182,7 @@
                 <w:sz w:val="17"/>
                 <w:szCs w:val="17"/>
               </w:rPr>
-              <w:t>Group</w:t>
+              <w:t>Date:</w:t>
             </w:r>
           </w:p>
           <w:p>
@@ -8749,7 +8203,7 @@
         <w:spacing w:before="40" w:after="100"/>
       </w:pPr>
       <w:r>
-        <w:t>Student A is the caller. Student B is Information Desk staff. Read the scenario below, write your script together using all 7 steps, then record a video of your call and send it to the class group chat.</w:t>
+        <w:t xml:space="preserve">Student A is the caller. Student B is Information Desk staff. Read the scenario below, create a script together using all 7 steps, then record a video of your call and send it to the class group chat.</w:t>
       </w:r>
     </w:p>
     <w:p>
@@ -8783,12 +8237,6 @@
         <w:gridCol w:w="5220"/>
       </w:tblGrid>
       <w:tr>
-        <w:tblPrEx>
-          <w:tblCellMar>
-            <w:top w:w="0" w:type="dxa"/>
-            <w:bottom w:w="0" w:type="dxa"/>
-          </w:tblCellMar>
-        </w:tblPrEx>
         <w:tc>
           <w:tcPr>
             <w:tcW w:w="2500" w:type="pct"/>
@@ -8831,12 +8279,6 @@
         </w:tc>
       </w:tr>
       <w:tr>
-        <w:tblPrEx>
-          <w:tblCellMar>
-            <w:top w:w="0" w:type="dxa"/>
-            <w:bottom w:w="0" w:type="dxa"/>
-          </w:tblCellMar>
-        </w:tblPrEx>
         <w:tc>
           <w:tcPr>
             <w:tcW w:w="2500" w:type="pct"/>
@@ -8879,12 +8321,6 @@
         </w:tc>
       </w:tr>
       <w:tr>
-        <w:tblPrEx>
-          <w:tblCellMar>
-            <w:top w:w="0" w:type="dxa"/>
-            <w:bottom w:w="0" w:type="dxa"/>
-          </w:tblCellMar>
-        </w:tblPrEx>
         <w:tc>
           <w:tcPr>
             <w:tcW w:w="2500" w:type="pct"/>
@@ -8927,12 +8363,6 @@
         </w:tc>
       </w:tr>
       <w:tr>
-        <w:tblPrEx>
-          <w:tblCellMar>
-            <w:top w:w="0" w:type="dxa"/>
-            <w:bottom w:w="0" w:type="dxa"/>
-          </w:tblCellMar>
-        </w:tblPrEx>
         <w:tc>
           <w:tcPr>
             <w:tcW w:w="2500" w:type="pct"/>
@@ -8998,12 +8428,6 @@
         <w:gridCol w:w="7830"/>
       </w:tblGrid>
       <w:tr>
-        <w:tblPrEx>
-          <w:tblCellMar>
-            <w:top w:w="0" w:type="dxa"/>
-            <w:bottom w:w="0" w:type="dxa"/>
-          </w:tblCellMar>
-        </w:tblPrEx>
         <w:tc>
           <w:tcPr>
             <w:tcW w:w="2400" w:type="dxa"/>
@@ -9280,12 +8704,6 @@
         <w:gridCol w:w="3480"/>
       </w:tblGrid>
       <w:tr>
-        <w:tblPrEx>
-          <w:tblCellMar>
-            <w:top w:w="0" w:type="dxa"/>
-            <w:bottom w:w="0" w:type="dxa"/>
-          </w:tblCellMar>
-        </w:tblPrEx>
         <w:tc>
           <w:tcPr>
             <w:tcW w:w="1650" w:type="pct"/>
@@ -9307,7 +8725,7 @@
                 <w:sz w:val="17"/>
                 <w:szCs w:val="17"/>
               </w:rPr>
-              <w:t>Student A (Caller)</w:t>
+              <w:t>Student A Name (Caller)</w:t>
             </w:r>
           </w:p>
           <w:p>
@@ -9342,7 +8760,7 @@
                 <w:sz w:val="17"/>
                 <w:szCs w:val="17"/>
               </w:rPr>
-              <w:t>Student B (Information Desk)</w:t>
+              <w:t>Student B Name (Information Desk)</w:t>
             </w:r>
           </w:p>
           <w:p>
@@ -9377,7 +8795,7 @@
                 <w:sz w:val="17"/>
                 <w:szCs w:val="17"/>
               </w:rPr>
-              <w:t>Group</w:t>
+              <w:t>Date:</w:t>
             </w:r>
           </w:p>
           <w:p>
@@ -9386,9 +8804,6 @@
                 <w:bottom w:val="single" w:sz="6" w:space="1" w:color="000000"/>
               </w:pBdr>
             </w:pPr>
-            <w:r>
-              <w:t xml:space="preserve"> </w:t>
-            </w:r>
           </w:p>
         </w:tc>
       </w:tr>
@@ -9398,7 +8813,7 @@
         <w:spacing w:before="40" w:after="100"/>
       </w:pPr>
       <w:r>
-        <w:t>Student A is the caller. Student B is Information Desk staff. Read the scenario below, write your script together using all 7 steps, then record a video of your call and send it to the class group chat.</w:t>
+        <w:t xml:space="preserve">Student A is the caller. Student B is Information Desk staff. Read the scenario below, create a script together using all 7 steps, then record a video of your call and send it to the class group chat.</w:t>
       </w:r>
     </w:p>
     <w:p>
@@ -9432,12 +8847,6 @@
         <w:gridCol w:w="5220"/>
       </w:tblGrid>
       <w:tr>
-        <w:tblPrEx>
-          <w:tblCellMar>
-            <w:top w:w="0" w:type="dxa"/>
-            <w:bottom w:w="0" w:type="dxa"/>
-          </w:tblCellMar>
-        </w:tblPrEx>
         <w:tc>
           <w:tcPr>
             <w:tcW w:w="2500" w:type="pct"/>
@@ -9480,12 +8889,6 @@
         </w:tc>
       </w:tr>
       <w:tr>
-        <w:tblPrEx>
-          <w:tblCellMar>
-            <w:top w:w="0" w:type="dxa"/>
-            <w:bottom w:w="0" w:type="dxa"/>
-          </w:tblCellMar>
-        </w:tblPrEx>
         <w:tc>
           <w:tcPr>
             <w:tcW w:w="2500" w:type="pct"/>
@@ -9528,12 +8931,6 @@
         </w:tc>
       </w:tr>
       <w:tr>
-        <w:tblPrEx>
-          <w:tblCellMar>
-            <w:top w:w="0" w:type="dxa"/>
-            <w:bottom w:w="0" w:type="dxa"/>
-          </w:tblCellMar>
-        </w:tblPrEx>
         <w:tc>
           <w:tcPr>
             <w:tcW w:w="2500" w:type="pct"/>
@@ -9576,12 +8973,6 @@
         </w:tc>
       </w:tr>
       <w:tr>
-        <w:tblPrEx>
-          <w:tblCellMar>
-            <w:top w:w="0" w:type="dxa"/>
-            <w:bottom w:w="0" w:type="dxa"/>
-          </w:tblCellMar>
-        </w:tblPrEx>
         <w:tc>
           <w:tcPr>
             <w:tcW w:w="2500" w:type="pct"/>
@@ -9647,12 +9038,6 @@
         <w:gridCol w:w="7830"/>
       </w:tblGrid>
       <w:tr>
-        <w:tblPrEx>
-          <w:tblCellMar>
-            <w:top w:w="0" w:type="dxa"/>
-            <w:bottom w:w="0" w:type="dxa"/>
-          </w:tblCellMar>
-        </w:tblPrEx>
         <w:tc>
           <w:tcPr>
             <w:tcW w:w="2400" w:type="dxa"/>
@@ -9929,12 +9314,6 @@
         <w:gridCol w:w="3480"/>
       </w:tblGrid>
       <w:tr>
-        <w:tblPrEx>
-          <w:tblCellMar>
-            <w:top w:w="0" w:type="dxa"/>
-            <w:bottom w:w="0" w:type="dxa"/>
-          </w:tblCellMar>
-        </w:tblPrEx>
         <w:tc>
           <w:tcPr>
             <w:tcW w:w="1650" w:type="pct"/>
@@ -9956,7 +9335,7 @@
                 <w:sz w:val="17"/>
                 <w:szCs w:val="17"/>
               </w:rPr>
-              <w:t>Student A (Caller)</w:t>
+              <w:t>Student A Name (Caller)</w:t>
             </w:r>
           </w:p>
           <w:p>
@@ -9991,7 +9370,7 @@
                 <w:sz w:val="17"/>
                 <w:szCs w:val="17"/>
               </w:rPr>
-              <w:t>Student B (Information Desk)</w:t>
+              <w:t>Student B Name (Information Desk)</w:t>
             </w:r>
           </w:p>
           <w:p>
@@ -10026,7 +9405,7 @@
                 <w:sz w:val="17"/>
                 <w:szCs w:val="17"/>
               </w:rPr>
-              <w:t>Group</w:t>
+              <w:t>Date:</w:t>
             </w:r>
           </w:p>
           <w:p>
@@ -10047,7 +9426,7 @@
         <w:spacing w:before="40" w:after="100"/>
       </w:pPr>
       <w:r>
-        <w:t>Student A is the caller. Student B is Information Desk staff. Read the scenario below, write your script together using all 7 steps, then record a video of your call and send it to the class group chat.</w:t>
+        <w:t xml:space="preserve">Student A is the caller. Student B is Information Desk staff. Read the scenario below, create a script together using all 7 steps, then record a video of your call and send it to the class group chat.</w:t>
       </w:r>
     </w:p>
     <w:p>
@@ -10081,12 +9460,6 @@
         <w:gridCol w:w="5220"/>
       </w:tblGrid>
       <w:tr>
-        <w:tblPrEx>
-          <w:tblCellMar>
-            <w:top w:w="0" w:type="dxa"/>
-            <w:bottom w:w="0" w:type="dxa"/>
-          </w:tblCellMar>
-        </w:tblPrEx>
         <w:tc>
           <w:tcPr>
             <w:tcW w:w="2500" w:type="pct"/>
@@ -10129,12 +9502,6 @@
         </w:tc>
       </w:tr>
       <w:tr>
-        <w:tblPrEx>
-          <w:tblCellMar>
-            <w:top w:w="0" w:type="dxa"/>
-            <w:bottom w:w="0" w:type="dxa"/>
-          </w:tblCellMar>
-        </w:tblPrEx>
         <w:tc>
           <w:tcPr>
             <w:tcW w:w="2500" w:type="pct"/>
@@ -10177,12 +9544,6 @@
         </w:tc>
       </w:tr>
       <w:tr>
-        <w:tblPrEx>
-          <w:tblCellMar>
-            <w:top w:w="0" w:type="dxa"/>
-            <w:bottom w:w="0" w:type="dxa"/>
-          </w:tblCellMar>
-        </w:tblPrEx>
         <w:tc>
           <w:tcPr>
             <w:tcW w:w="2500" w:type="pct"/>
@@ -10225,12 +9586,6 @@
         </w:tc>
       </w:tr>
       <w:tr>
-        <w:tblPrEx>
-          <w:tblCellMar>
-            <w:top w:w="0" w:type="dxa"/>
-            <w:bottom w:w="0" w:type="dxa"/>
-          </w:tblCellMar>
-        </w:tblPrEx>
         <w:tc>
           <w:tcPr>
             <w:tcW w:w="2500" w:type="pct"/>
@@ -10296,12 +9651,6 @@
         <w:gridCol w:w="7830"/>
       </w:tblGrid>
       <w:tr>
-        <w:tblPrEx>
-          <w:tblCellMar>
-            <w:top w:w="0" w:type="dxa"/>
-            <w:bottom w:w="0" w:type="dxa"/>
-          </w:tblCellMar>
-        </w:tblPrEx>
         <w:tc>
           <w:tcPr>
             <w:tcW w:w="2400" w:type="dxa"/>
@@ -10578,12 +9927,6 @@
         <w:gridCol w:w="3480"/>
       </w:tblGrid>
       <w:tr>
-        <w:tblPrEx>
-          <w:tblCellMar>
-            <w:top w:w="0" w:type="dxa"/>
-            <w:bottom w:w="0" w:type="dxa"/>
-          </w:tblCellMar>
-        </w:tblPrEx>
         <w:tc>
           <w:tcPr>
             <w:tcW w:w="1650" w:type="pct"/>
@@ -10605,7 +9948,7 @@
                 <w:sz w:val="17"/>
                 <w:szCs w:val="17"/>
               </w:rPr>
-              <w:t>Student A (Caller)</w:t>
+              <w:t>Student A Name (Caller)</w:t>
             </w:r>
           </w:p>
           <w:p>
@@ -10640,7 +9983,7 @@
                 <w:sz w:val="17"/>
                 <w:szCs w:val="17"/>
               </w:rPr>
-              <w:t>Student B (Information Desk)</w:t>
+              <w:t>Student B Name (Information Desk)</w:t>
             </w:r>
           </w:p>
           <w:p>
@@ -10675,7 +10018,7 @@
                 <w:sz w:val="17"/>
                 <w:szCs w:val="17"/>
               </w:rPr>
-              <w:t>Group</w:t>
+              <w:t>Date:</w:t>
             </w:r>
           </w:p>
           <w:p>
@@ -10696,7 +10039,7 @@
         <w:spacing w:before="40" w:after="100"/>
       </w:pPr>
       <w:r>
-        <w:t>Student A is the caller. Student B is Information Desk staff. Read the scenario below, write your script together using all 7 steps, then record a video of your call and send it to the class group chat.</w:t>
+        <w:t xml:space="preserve">Student A is the caller. Student B is Information Desk staff. Read the scenario below, create a script together using all 7 steps, then record a video of your call and send it to the class group chat.</w:t>
       </w:r>
     </w:p>
     <w:p>
@@ -10730,12 +10073,6 @@
         <w:gridCol w:w="5220"/>
       </w:tblGrid>
       <w:tr>
-        <w:tblPrEx>
-          <w:tblCellMar>
-            <w:top w:w="0" w:type="dxa"/>
-            <w:bottom w:w="0" w:type="dxa"/>
-          </w:tblCellMar>
-        </w:tblPrEx>
         <w:tc>
           <w:tcPr>
             <w:tcW w:w="2500" w:type="pct"/>
@@ -10778,12 +10115,6 @@
         </w:tc>
       </w:tr>
       <w:tr>
-        <w:tblPrEx>
-          <w:tblCellMar>
-            <w:top w:w="0" w:type="dxa"/>
-            <w:bottom w:w="0" w:type="dxa"/>
-          </w:tblCellMar>
-        </w:tblPrEx>
         <w:tc>
           <w:tcPr>
             <w:tcW w:w="2500" w:type="pct"/>
@@ -10826,12 +10157,6 @@
         </w:tc>
       </w:tr>
       <w:tr>
-        <w:tblPrEx>
-          <w:tblCellMar>
-            <w:top w:w="0" w:type="dxa"/>
-            <w:bottom w:w="0" w:type="dxa"/>
-          </w:tblCellMar>
-        </w:tblPrEx>
         <w:tc>
           <w:tcPr>
             <w:tcW w:w="2500" w:type="pct"/>
@@ -10874,12 +10199,6 @@
         </w:tc>
       </w:tr>
       <w:tr>
-        <w:tblPrEx>
-          <w:tblCellMar>
-            <w:top w:w="0" w:type="dxa"/>
-            <w:bottom w:w="0" w:type="dxa"/>
-          </w:tblCellMar>
-        </w:tblPrEx>
         <w:tc>
           <w:tcPr>
             <w:tcW w:w="2500" w:type="pct"/>
@@ -10945,12 +10264,6 @@
         <w:gridCol w:w="7830"/>
       </w:tblGrid>
       <w:tr>
-        <w:tblPrEx>
-          <w:tblCellMar>
-            <w:top w:w="0" w:type="dxa"/>
-            <w:bottom w:w="0" w:type="dxa"/>
-          </w:tblCellMar>
-        </w:tblPrEx>
         <w:tc>
           <w:tcPr>
             <w:tcW w:w="2400" w:type="dxa"/>
@@ -11037,7 +10350,7 @@
                 <w:sz w:val="19"/>
                 <w:szCs w:val="19"/>
               </w:rPr>
-              <w:t>"The phone rings. One of your colleagues told me something different on the phone earlier. Who's right?"</w:t>
+              <w:t>"The phone rings. One of your colleagues told me the closing ceremony starts at 5pm, but someone else said 5:30. Which is right?"</w:t>
             </w:r>
           </w:p>
           <w:p>
@@ -11046,7 +10359,7 @@
                 <w:sz w:val="19"/>
                 <w:szCs w:val="19"/>
               </w:rPr>
-              <w:t>Two staff members gave different information. It's not your job to guess who's right.</w:t>
+              <w:t>One staff member said 5:00pm, another said 5:30pm. It's not your job to guess who's right, check before you answer.</w:t>
             </w:r>
           </w:p>
         </w:tc>
@@ -11227,12 +10540,6 @@
         <w:gridCol w:w="3480"/>
       </w:tblGrid>
       <w:tr>
-        <w:tblPrEx>
-          <w:tblCellMar>
-            <w:top w:w="0" w:type="dxa"/>
-            <w:bottom w:w="0" w:type="dxa"/>
-          </w:tblCellMar>
-        </w:tblPrEx>
         <w:tc>
           <w:tcPr>
             <w:tcW w:w="1650" w:type="pct"/>
@@ -11254,7 +10561,7 @@
                 <w:sz w:val="17"/>
                 <w:szCs w:val="17"/>
               </w:rPr>
-              <w:t>Student A (Caller)</w:t>
+              <w:t>Student A Name (Caller)</w:t>
             </w:r>
           </w:p>
           <w:p>
@@ -11289,7 +10596,7 @@
                 <w:sz w:val="17"/>
                 <w:szCs w:val="17"/>
               </w:rPr>
-              <w:t>Student B (Information Desk)</w:t>
+              <w:t>Student B Name (Information Desk)</w:t>
             </w:r>
           </w:p>
           <w:p>
@@ -11324,7 +10631,7 @@
                 <w:sz w:val="17"/>
                 <w:szCs w:val="17"/>
               </w:rPr>
-              <w:t>Group</w:t>
+              <w:t>Date:</w:t>
             </w:r>
           </w:p>
           <w:p>
@@ -11345,7 +10652,7 @@
         <w:spacing w:before="40" w:after="100"/>
       </w:pPr>
       <w:r>
-        <w:t>Student A is the caller. Student B is Information Desk staff. Read the scenario below, write your script together using all 7 steps, then record a video of your call and send it to the class group chat.</w:t>
+        <w:t xml:space="preserve">Student A is the caller. Student B is Information Desk staff. Read the scenario below, create a script together using all 7 steps, then record a video of your call and send it to the class group chat.</w:t>
       </w:r>
     </w:p>
     <w:p>
@@ -11379,12 +10686,6 @@
         <w:gridCol w:w="5220"/>
       </w:tblGrid>
       <w:tr>
-        <w:tblPrEx>
-          <w:tblCellMar>
-            <w:top w:w="0" w:type="dxa"/>
-            <w:bottom w:w="0" w:type="dxa"/>
-          </w:tblCellMar>
-        </w:tblPrEx>
         <w:tc>
           <w:tcPr>
             <w:tcW w:w="2500" w:type="pct"/>
@@ -11427,12 +10728,6 @@
         </w:tc>
       </w:tr>
       <w:tr>
-        <w:tblPrEx>
-          <w:tblCellMar>
-            <w:top w:w="0" w:type="dxa"/>
-            <w:bottom w:w="0" w:type="dxa"/>
-          </w:tblCellMar>
-        </w:tblPrEx>
         <w:tc>
           <w:tcPr>
             <w:tcW w:w="2500" w:type="pct"/>
@@ -11475,12 +10770,6 @@
         </w:tc>
       </w:tr>
       <w:tr>
-        <w:tblPrEx>
-          <w:tblCellMar>
-            <w:top w:w="0" w:type="dxa"/>
-            <w:bottom w:w="0" w:type="dxa"/>
-          </w:tblCellMar>
-        </w:tblPrEx>
         <w:tc>
           <w:tcPr>
             <w:tcW w:w="2500" w:type="pct"/>
@@ -11523,12 +10812,6 @@
         </w:tc>
       </w:tr>
       <w:tr>
-        <w:tblPrEx>
-          <w:tblCellMar>
-            <w:top w:w="0" w:type="dxa"/>
-            <w:bottom w:w="0" w:type="dxa"/>
-          </w:tblCellMar>
-        </w:tblPrEx>
         <w:tc>
           <w:tcPr>
             <w:tcW w:w="2500" w:type="pct"/>
@@ -11594,12 +10877,6 @@
         <w:gridCol w:w="7830"/>
       </w:tblGrid>
       <w:tr>
-        <w:tblPrEx>
-          <w:tblCellMar>
-            <w:top w:w="0" w:type="dxa"/>
-            <w:bottom w:w="0" w:type="dxa"/>
-          </w:tblCellMar>
-        </w:tblPrEx>
         <w:tc>
           <w:tcPr>
             <w:tcW w:w="2400" w:type="dxa"/>
@@ -11891,12 +11168,6 @@
         <w:gridCol w:w="3480"/>
       </w:tblGrid>
       <w:tr>
-        <w:tblPrEx>
-          <w:tblCellMar>
-            <w:top w:w="0" w:type="dxa"/>
-            <w:bottom w:w="0" w:type="dxa"/>
-          </w:tblCellMar>
-        </w:tblPrEx>
         <w:tc>
           <w:tcPr>
             <w:tcW w:w="1650" w:type="pct"/>
@@ -11918,7 +11189,7 @@
                 <w:sz w:val="17"/>
                 <w:szCs w:val="17"/>
               </w:rPr>
-              <w:t>Student A (Caller)</w:t>
+              <w:t>Student A Name (Caller)</w:t>
             </w:r>
           </w:p>
           <w:p>
@@ -11953,7 +11224,7 @@
                 <w:sz w:val="17"/>
                 <w:szCs w:val="17"/>
               </w:rPr>
-              <w:t>Student B (Information Desk)</w:t>
+              <w:t>Student B Name (Information Desk)</w:t>
             </w:r>
           </w:p>
           <w:p>
@@ -11988,7 +11259,7 @@
                 <w:sz w:val="17"/>
                 <w:szCs w:val="17"/>
               </w:rPr>
-              <w:t>Group</w:t>
+              <w:t>Date:</w:t>
             </w:r>
           </w:p>
           <w:p>
@@ -12009,7 +11280,7 @@
         <w:spacing w:before="40" w:after="100"/>
       </w:pPr>
       <w:r>
-        <w:t>Student A is the caller. Student B is Information Desk staff. Read the scenario below, write your script together using all 7 steps, then record a video of your call and send it to the class group chat.</w:t>
+        <w:t xml:space="preserve">Student A is the caller. Student B is Information Desk staff. Read the scenario below, create a script together using all 7 steps, then record a video of your call and send it to the class group chat.</w:t>
       </w:r>
     </w:p>
     <w:p>
@@ -12043,12 +11314,6 @@
         <w:gridCol w:w="5220"/>
       </w:tblGrid>
       <w:tr>
-        <w:tblPrEx>
-          <w:tblCellMar>
-            <w:top w:w="0" w:type="dxa"/>
-            <w:bottom w:w="0" w:type="dxa"/>
-          </w:tblCellMar>
-        </w:tblPrEx>
         <w:tc>
           <w:tcPr>
             <w:tcW w:w="2500" w:type="pct"/>
@@ -12091,12 +11356,6 @@
         </w:tc>
       </w:tr>
       <w:tr>
-        <w:tblPrEx>
-          <w:tblCellMar>
-            <w:top w:w="0" w:type="dxa"/>
-            <w:bottom w:w="0" w:type="dxa"/>
-          </w:tblCellMar>
-        </w:tblPrEx>
         <w:tc>
           <w:tcPr>
             <w:tcW w:w="2500" w:type="pct"/>
@@ -12139,12 +11398,6 @@
         </w:tc>
       </w:tr>
       <w:tr>
-        <w:tblPrEx>
-          <w:tblCellMar>
-            <w:top w:w="0" w:type="dxa"/>
-            <w:bottom w:w="0" w:type="dxa"/>
-          </w:tblCellMar>
-        </w:tblPrEx>
         <w:tc>
           <w:tcPr>
             <w:tcW w:w="2500" w:type="pct"/>
@@ -12187,12 +11440,6 @@
         </w:tc>
       </w:tr>
       <w:tr>
-        <w:tblPrEx>
-          <w:tblCellMar>
-            <w:top w:w="0" w:type="dxa"/>
-            <w:bottom w:w="0" w:type="dxa"/>
-          </w:tblCellMar>
-        </w:tblPrEx>
         <w:tc>
           <w:tcPr>
             <w:tcW w:w="2500" w:type="pct"/>
@@ -12258,12 +11505,6 @@
         <w:gridCol w:w="7830"/>
       </w:tblGrid>
       <w:tr>
-        <w:tblPrEx>
-          <w:tblCellMar>
-            <w:top w:w="0" w:type="dxa"/>
-            <w:bottom w:w="0" w:type="dxa"/>
-          </w:tblCellMar>
-        </w:tblPrEx>
         <w:tc>
           <w:tcPr>
             <w:tcW w:w="2400" w:type="dxa"/>

</xml_diff>

<commit_message>
Require the written script on Unit 10 Speaking Task cards
Removed "(optional)" from "Write your script below" across all 19
cards so pairs plan their language on paper before recording,
instead of skipping straight to an unplanned video.

Co-Authored-By: Claude Sonnet 5 <noreply@anthropic.com>
</commit_message>
<xml_diff>
--- a/_deliverables/MICE-Unit10-Speaking-Task-Cards.docx
+++ b/_deliverables/MICE-Unit10-Speaking-Task-Cards.docx
@@ -496,7 +496,7 @@
           <w:sz w:val="19"/>
           <w:szCs w:val="19"/>
         </w:rPr>
-        <w:t xml:space="preserve">Write your script below (optional).</w:t>
+        <w:t xml:space="preserve">Write your script below.</w:t>
       </w:r>
     </w:p>
     <w:p>
@@ -1109,7 +1109,7 @@
           <w:sz w:val="19"/>
           <w:szCs w:val="19"/>
         </w:rPr>
-        <w:t xml:space="preserve">Write your script below (optional).</w:t>
+        <w:t xml:space="preserve">Write your script below.</w:t>
       </w:r>
     </w:p>
     <w:p>
@@ -1722,7 +1722,7 @@
           <w:sz w:val="19"/>
           <w:szCs w:val="19"/>
         </w:rPr>
-        <w:t>Write your script below (optional).</w:t>
+        <w:t>Write your script below.</w:t>
       </w:r>
     </w:p>
     <w:p>
@@ -2335,7 +2335,7 @@
           <w:sz w:val="19"/>
           <w:szCs w:val="19"/>
         </w:rPr>
-        <w:t>Write your script below (optional).</w:t>
+        <w:t>Write your script below.</w:t>
       </w:r>
     </w:p>
     <w:p>
@@ -2948,7 +2948,7 @@
           <w:sz w:val="19"/>
           <w:szCs w:val="19"/>
         </w:rPr>
-        <w:t>Write your script below (optional).</w:t>
+        <w:t>Write your script below.</w:t>
       </w:r>
     </w:p>
     <w:p>
@@ -3576,7 +3576,7 @@
           <w:sz w:val="19"/>
           <w:szCs w:val="19"/>
         </w:rPr>
-        <w:t>Write your script below (optional).</w:t>
+        <w:t>Write your script below.</w:t>
       </w:r>
     </w:p>
     <w:p>
@@ -4189,7 +4189,7 @@
           <w:sz w:val="19"/>
           <w:szCs w:val="19"/>
         </w:rPr>
-        <w:t>Write your script below (optional).</w:t>
+        <w:t>Write your script below.</w:t>
       </w:r>
     </w:p>
     <w:p>
@@ -4802,7 +4802,7 @@
           <w:sz w:val="19"/>
           <w:szCs w:val="19"/>
         </w:rPr>
-        <w:t>Write your script below (optional).</w:t>
+        <w:t>Write your script below.</w:t>
       </w:r>
     </w:p>
     <w:p>
@@ -5430,7 +5430,7 @@
           <w:sz w:val="19"/>
           <w:szCs w:val="19"/>
         </w:rPr>
-        <w:t>Write your script below (optional).</w:t>
+        <w:t>Write your script below.</w:t>
       </w:r>
     </w:p>
     <w:p>
@@ -6058,7 +6058,7 @@
           <w:sz w:val="19"/>
           <w:szCs w:val="19"/>
         </w:rPr>
-        <w:t>Write your script below (optional).</w:t>
+        <w:t>Write your script below.</w:t>
       </w:r>
     </w:p>
     <w:p>
@@ -6686,7 +6686,7 @@
           <w:sz w:val="19"/>
           <w:szCs w:val="19"/>
         </w:rPr>
-        <w:t>Write your script below (optional).</w:t>
+        <w:t>Write your script below.</w:t>
       </w:r>
     </w:p>
     <w:p>
@@ -7314,7 +7314,7 @@
           <w:sz w:val="19"/>
           <w:szCs w:val="19"/>
         </w:rPr>
-        <w:t>Write your script below (optional).</w:t>
+        <w:t>Write your script below.</w:t>
       </w:r>
     </w:p>
     <w:p>
@@ -7927,7 +7927,7 @@
           <w:sz w:val="19"/>
           <w:szCs w:val="19"/>
         </w:rPr>
-        <w:t>Write your script below (optional).</w:t>
+        <w:t>Write your script below.</w:t>
       </w:r>
     </w:p>
     <w:p>
@@ -8540,7 +8540,7 @@
           <w:sz w:val="19"/>
           <w:szCs w:val="19"/>
         </w:rPr>
-        <w:t>Write your script below (optional).</w:t>
+        <w:t>Write your script below.</w:t>
       </w:r>
     </w:p>
     <w:p>
@@ -9150,7 +9150,7 @@
           <w:sz w:val="19"/>
           <w:szCs w:val="19"/>
         </w:rPr>
-        <w:t>Write your script below (optional).</w:t>
+        <w:t>Write your script below.</w:t>
       </w:r>
     </w:p>
     <w:p>
@@ -9763,7 +9763,7 @@
           <w:sz w:val="19"/>
           <w:szCs w:val="19"/>
         </w:rPr>
-        <w:t>Write your script below (optional).</w:t>
+        <w:t>Write your script below.</w:t>
       </w:r>
     </w:p>
     <w:p>
@@ -10376,7 +10376,7 @@
           <w:sz w:val="19"/>
           <w:szCs w:val="19"/>
         </w:rPr>
-        <w:t>Write your script below (optional).</w:t>
+        <w:t>Write your script below.</w:t>
       </w:r>
     </w:p>
     <w:p>
@@ -11004,7 +11004,7 @@
           <w:sz w:val="19"/>
           <w:szCs w:val="19"/>
         </w:rPr>
-        <w:t>Write your script below (optional).</w:t>
+        <w:t>Write your script below.</w:t>
       </w:r>
     </w:p>
     <w:p>
@@ -11617,7 +11617,7 @@
           <w:sz w:val="19"/>
           <w:szCs w:val="19"/>
         </w:rPr>
-        <w:t>Write your script below (optional).</w:t>
+        <w:t>Write your script below.</w:t>
       </w:r>
     </w:p>
     <w:p>

</xml_diff>

<commit_message>
Extend script lines to fill the page on Unit 10 Speaking Task cards
Added 8 more blank lines per card (10 -> 18) so the writing area
runs to the bottom of the sheet instead of leaving half the page
empty.

Co-Authored-By: Claude Sonnet 5 <noreply@anthropic.com>
</commit_message>
<xml_diff>
--- a/_deliverables/MICE-Unit10-Speaking-Task-Cards.docx
+++ b/_deliverables/MICE-Unit10-Speaking-Task-Cards.docx
@@ -610,6 +610,94 @@
       </w:r>
     </w:p>
     <w:p>
+      <w:pPr>
+        <w:spacing w:after="190"/>
+      </w:pPr>
+      <w:r>
+        <w:rPr>
+          <w:color w:val="999999"/>
+        </w:rPr>
+        <w:t>____________________________________________________________________________________________________</w:t>
+      </w:r>
+    </w:p>
+    <w:p>
+      <w:pPr>
+        <w:spacing w:after="190"/>
+      </w:pPr>
+      <w:r>
+        <w:rPr>
+          <w:color w:val="999999"/>
+        </w:rPr>
+        <w:t>____________________________________________________________________________________________________</w:t>
+      </w:r>
+    </w:p>
+    <w:p>
+      <w:pPr>
+        <w:spacing w:after="190"/>
+      </w:pPr>
+      <w:r>
+        <w:rPr>
+          <w:color w:val="999999"/>
+        </w:rPr>
+        <w:t>____________________________________________________________________________________________________</w:t>
+      </w:r>
+    </w:p>
+    <w:p>
+      <w:pPr>
+        <w:spacing w:after="190"/>
+      </w:pPr>
+      <w:r>
+        <w:rPr>
+          <w:color w:val="999999"/>
+        </w:rPr>
+        <w:t>____________________________________________________________________________________________________</w:t>
+      </w:r>
+    </w:p>
+    <w:p>
+      <w:pPr>
+        <w:spacing w:after="190"/>
+      </w:pPr>
+      <w:r>
+        <w:rPr>
+          <w:color w:val="999999"/>
+        </w:rPr>
+        <w:t>____________________________________________________________________________________________________</w:t>
+      </w:r>
+    </w:p>
+    <w:p>
+      <w:pPr>
+        <w:spacing w:after="190"/>
+      </w:pPr>
+      <w:r>
+        <w:rPr>
+          <w:color w:val="999999"/>
+        </w:rPr>
+        <w:t>____________________________________________________________________________________________________</w:t>
+      </w:r>
+    </w:p>
+    <w:p>
+      <w:pPr>
+        <w:spacing w:after="190"/>
+      </w:pPr>
+      <w:r>
+        <w:rPr>
+          <w:color w:val="999999"/>
+        </w:rPr>
+        <w:t>____________________________________________________________________________________________________</w:t>
+      </w:r>
+    </w:p>
+    <w:p>
+      <w:pPr>
+        <w:spacing w:after="190"/>
+      </w:pPr>
+      <w:r>
+        <w:rPr>
+          <w:color w:val="999999"/>
+        </w:rPr>
+        <w:t>____________________________________________________________________________________________________</w:t>
+      </w:r>
+    </w:p>
+    <w:p>
       <w:r>
         <w:br w:type="page"/>
       </w:r>
@@ -1223,6 +1311,94 @@
       </w:r>
     </w:p>
     <w:p>
+      <w:pPr>
+        <w:spacing w:after="190"/>
+      </w:pPr>
+      <w:r>
+        <w:rPr>
+          <w:color w:val="999999"/>
+        </w:rPr>
+        <w:t>____________________________________________________________________________________________________</w:t>
+      </w:r>
+    </w:p>
+    <w:p>
+      <w:pPr>
+        <w:spacing w:after="190"/>
+      </w:pPr>
+      <w:r>
+        <w:rPr>
+          <w:color w:val="999999"/>
+        </w:rPr>
+        <w:t>____________________________________________________________________________________________________</w:t>
+      </w:r>
+    </w:p>
+    <w:p>
+      <w:pPr>
+        <w:spacing w:after="190"/>
+      </w:pPr>
+      <w:r>
+        <w:rPr>
+          <w:color w:val="999999"/>
+        </w:rPr>
+        <w:t>____________________________________________________________________________________________________</w:t>
+      </w:r>
+    </w:p>
+    <w:p>
+      <w:pPr>
+        <w:spacing w:after="190"/>
+      </w:pPr>
+      <w:r>
+        <w:rPr>
+          <w:color w:val="999999"/>
+        </w:rPr>
+        <w:t>____________________________________________________________________________________________________</w:t>
+      </w:r>
+    </w:p>
+    <w:p>
+      <w:pPr>
+        <w:spacing w:after="190"/>
+      </w:pPr>
+      <w:r>
+        <w:rPr>
+          <w:color w:val="999999"/>
+        </w:rPr>
+        <w:t>____________________________________________________________________________________________________</w:t>
+      </w:r>
+    </w:p>
+    <w:p>
+      <w:pPr>
+        <w:spacing w:after="190"/>
+      </w:pPr>
+      <w:r>
+        <w:rPr>
+          <w:color w:val="999999"/>
+        </w:rPr>
+        <w:t>____________________________________________________________________________________________________</w:t>
+      </w:r>
+    </w:p>
+    <w:p>
+      <w:pPr>
+        <w:spacing w:after="190"/>
+      </w:pPr>
+      <w:r>
+        <w:rPr>
+          <w:color w:val="999999"/>
+        </w:rPr>
+        <w:t>____________________________________________________________________________________________________</w:t>
+      </w:r>
+    </w:p>
+    <w:p>
+      <w:pPr>
+        <w:spacing w:after="190"/>
+      </w:pPr>
+      <w:r>
+        <w:rPr>
+          <w:color w:val="999999"/>
+        </w:rPr>
+        <w:t>____________________________________________________________________________________________________</w:t>
+      </w:r>
+    </w:p>
+    <w:p>
       <w:r>
         <w:br w:type="page"/>
       </w:r>
@@ -1836,6 +2012,94 @@
       </w:r>
     </w:p>
     <w:p>
+      <w:pPr>
+        <w:spacing w:after="190"/>
+      </w:pPr>
+      <w:r>
+        <w:rPr>
+          <w:color w:val="999999"/>
+        </w:rPr>
+        <w:t>____________________________________________________________________________________________________</w:t>
+      </w:r>
+    </w:p>
+    <w:p>
+      <w:pPr>
+        <w:spacing w:after="190"/>
+      </w:pPr>
+      <w:r>
+        <w:rPr>
+          <w:color w:val="999999"/>
+        </w:rPr>
+        <w:t>____________________________________________________________________________________________________</w:t>
+      </w:r>
+    </w:p>
+    <w:p>
+      <w:pPr>
+        <w:spacing w:after="190"/>
+      </w:pPr>
+      <w:r>
+        <w:rPr>
+          <w:color w:val="999999"/>
+        </w:rPr>
+        <w:t>____________________________________________________________________________________________________</w:t>
+      </w:r>
+    </w:p>
+    <w:p>
+      <w:pPr>
+        <w:spacing w:after="190"/>
+      </w:pPr>
+      <w:r>
+        <w:rPr>
+          <w:color w:val="999999"/>
+        </w:rPr>
+        <w:t>____________________________________________________________________________________________________</w:t>
+      </w:r>
+    </w:p>
+    <w:p>
+      <w:pPr>
+        <w:spacing w:after="190"/>
+      </w:pPr>
+      <w:r>
+        <w:rPr>
+          <w:color w:val="999999"/>
+        </w:rPr>
+        <w:t>____________________________________________________________________________________________________</w:t>
+      </w:r>
+    </w:p>
+    <w:p>
+      <w:pPr>
+        <w:spacing w:after="190"/>
+      </w:pPr>
+      <w:r>
+        <w:rPr>
+          <w:color w:val="999999"/>
+        </w:rPr>
+        <w:t>____________________________________________________________________________________________________</w:t>
+      </w:r>
+    </w:p>
+    <w:p>
+      <w:pPr>
+        <w:spacing w:after="190"/>
+      </w:pPr>
+      <w:r>
+        <w:rPr>
+          <w:color w:val="999999"/>
+        </w:rPr>
+        <w:t>____________________________________________________________________________________________________</w:t>
+      </w:r>
+    </w:p>
+    <w:p>
+      <w:pPr>
+        <w:spacing w:after="190"/>
+      </w:pPr>
+      <w:r>
+        <w:rPr>
+          <w:color w:val="999999"/>
+        </w:rPr>
+        <w:t>____________________________________________________________________________________________________</w:t>
+      </w:r>
+    </w:p>
+    <w:p>
       <w:r>
         <w:br w:type="page"/>
       </w:r>
@@ -2449,6 +2713,94 @@
       </w:r>
     </w:p>
     <w:p>
+      <w:pPr>
+        <w:spacing w:after="190"/>
+      </w:pPr>
+      <w:r>
+        <w:rPr>
+          <w:color w:val="999999"/>
+        </w:rPr>
+        <w:t>____________________________________________________________________________________________________</w:t>
+      </w:r>
+    </w:p>
+    <w:p>
+      <w:pPr>
+        <w:spacing w:after="190"/>
+      </w:pPr>
+      <w:r>
+        <w:rPr>
+          <w:color w:val="999999"/>
+        </w:rPr>
+        <w:t>____________________________________________________________________________________________________</w:t>
+      </w:r>
+    </w:p>
+    <w:p>
+      <w:pPr>
+        <w:spacing w:after="190"/>
+      </w:pPr>
+      <w:r>
+        <w:rPr>
+          <w:color w:val="999999"/>
+        </w:rPr>
+        <w:t>____________________________________________________________________________________________________</w:t>
+      </w:r>
+    </w:p>
+    <w:p>
+      <w:pPr>
+        <w:spacing w:after="190"/>
+      </w:pPr>
+      <w:r>
+        <w:rPr>
+          <w:color w:val="999999"/>
+        </w:rPr>
+        <w:t>____________________________________________________________________________________________________</w:t>
+      </w:r>
+    </w:p>
+    <w:p>
+      <w:pPr>
+        <w:spacing w:after="190"/>
+      </w:pPr>
+      <w:r>
+        <w:rPr>
+          <w:color w:val="999999"/>
+        </w:rPr>
+        <w:t>____________________________________________________________________________________________________</w:t>
+      </w:r>
+    </w:p>
+    <w:p>
+      <w:pPr>
+        <w:spacing w:after="190"/>
+      </w:pPr>
+      <w:r>
+        <w:rPr>
+          <w:color w:val="999999"/>
+        </w:rPr>
+        <w:t>____________________________________________________________________________________________________</w:t>
+      </w:r>
+    </w:p>
+    <w:p>
+      <w:pPr>
+        <w:spacing w:after="190"/>
+      </w:pPr>
+      <w:r>
+        <w:rPr>
+          <w:color w:val="999999"/>
+        </w:rPr>
+        <w:t>____________________________________________________________________________________________________</w:t>
+      </w:r>
+    </w:p>
+    <w:p>
+      <w:pPr>
+        <w:spacing w:after="190"/>
+      </w:pPr>
+      <w:r>
+        <w:rPr>
+          <w:color w:val="999999"/>
+        </w:rPr>
+        <w:t>____________________________________________________________________________________________________</w:t>
+      </w:r>
+    </w:p>
+    <w:p>
       <w:r>
         <w:br w:type="page"/>
       </w:r>
@@ -3062,6 +3414,94 @@
       </w:r>
     </w:p>
     <w:p>
+      <w:pPr>
+        <w:spacing w:after="190"/>
+      </w:pPr>
+      <w:r>
+        <w:rPr>
+          <w:color w:val="999999"/>
+        </w:rPr>
+        <w:t>____________________________________________________________________________________________________</w:t>
+      </w:r>
+    </w:p>
+    <w:p>
+      <w:pPr>
+        <w:spacing w:after="190"/>
+      </w:pPr>
+      <w:r>
+        <w:rPr>
+          <w:color w:val="999999"/>
+        </w:rPr>
+        <w:t>____________________________________________________________________________________________________</w:t>
+      </w:r>
+    </w:p>
+    <w:p>
+      <w:pPr>
+        <w:spacing w:after="190"/>
+      </w:pPr>
+      <w:r>
+        <w:rPr>
+          <w:color w:val="999999"/>
+        </w:rPr>
+        <w:t>____________________________________________________________________________________________________</w:t>
+      </w:r>
+    </w:p>
+    <w:p>
+      <w:pPr>
+        <w:spacing w:after="190"/>
+      </w:pPr>
+      <w:r>
+        <w:rPr>
+          <w:color w:val="999999"/>
+        </w:rPr>
+        <w:t>____________________________________________________________________________________________________</w:t>
+      </w:r>
+    </w:p>
+    <w:p>
+      <w:pPr>
+        <w:spacing w:after="190"/>
+      </w:pPr>
+      <w:r>
+        <w:rPr>
+          <w:color w:val="999999"/>
+        </w:rPr>
+        <w:t>____________________________________________________________________________________________________</w:t>
+      </w:r>
+    </w:p>
+    <w:p>
+      <w:pPr>
+        <w:spacing w:after="190"/>
+      </w:pPr>
+      <w:r>
+        <w:rPr>
+          <w:color w:val="999999"/>
+        </w:rPr>
+        <w:t>____________________________________________________________________________________________________</w:t>
+      </w:r>
+    </w:p>
+    <w:p>
+      <w:pPr>
+        <w:spacing w:after="190"/>
+      </w:pPr>
+      <w:r>
+        <w:rPr>
+          <w:color w:val="999999"/>
+        </w:rPr>
+        <w:t>____________________________________________________________________________________________________</w:t>
+      </w:r>
+    </w:p>
+    <w:p>
+      <w:pPr>
+        <w:spacing w:after="190"/>
+      </w:pPr>
+      <w:r>
+        <w:rPr>
+          <w:color w:val="999999"/>
+        </w:rPr>
+        <w:t>____________________________________________________________________________________________________</w:t>
+      </w:r>
+    </w:p>
+    <w:p>
       <w:r>
         <w:br w:type="page"/>
       </w:r>
@@ -3690,6 +4130,94 @@
       </w:r>
     </w:p>
     <w:p>
+      <w:pPr>
+        <w:spacing w:after="190"/>
+      </w:pPr>
+      <w:r>
+        <w:rPr>
+          <w:color w:val="999999"/>
+        </w:rPr>
+        <w:t>____________________________________________________________________________________________________</w:t>
+      </w:r>
+    </w:p>
+    <w:p>
+      <w:pPr>
+        <w:spacing w:after="190"/>
+      </w:pPr>
+      <w:r>
+        <w:rPr>
+          <w:color w:val="999999"/>
+        </w:rPr>
+        <w:t>____________________________________________________________________________________________________</w:t>
+      </w:r>
+    </w:p>
+    <w:p>
+      <w:pPr>
+        <w:spacing w:after="190"/>
+      </w:pPr>
+      <w:r>
+        <w:rPr>
+          <w:color w:val="999999"/>
+        </w:rPr>
+        <w:t>____________________________________________________________________________________________________</w:t>
+      </w:r>
+    </w:p>
+    <w:p>
+      <w:pPr>
+        <w:spacing w:after="190"/>
+      </w:pPr>
+      <w:r>
+        <w:rPr>
+          <w:color w:val="999999"/>
+        </w:rPr>
+        <w:t>____________________________________________________________________________________________________</w:t>
+      </w:r>
+    </w:p>
+    <w:p>
+      <w:pPr>
+        <w:spacing w:after="190"/>
+      </w:pPr>
+      <w:r>
+        <w:rPr>
+          <w:color w:val="999999"/>
+        </w:rPr>
+        <w:t>____________________________________________________________________________________________________</w:t>
+      </w:r>
+    </w:p>
+    <w:p>
+      <w:pPr>
+        <w:spacing w:after="190"/>
+      </w:pPr>
+      <w:r>
+        <w:rPr>
+          <w:color w:val="999999"/>
+        </w:rPr>
+        <w:t>____________________________________________________________________________________________________</w:t>
+      </w:r>
+    </w:p>
+    <w:p>
+      <w:pPr>
+        <w:spacing w:after="190"/>
+      </w:pPr>
+      <w:r>
+        <w:rPr>
+          <w:color w:val="999999"/>
+        </w:rPr>
+        <w:t>____________________________________________________________________________________________________</w:t>
+      </w:r>
+    </w:p>
+    <w:p>
+      <w:pPr>
+        <w:spacing w:after="190"/>
+      </w:pPr>
+      <w:r>
+        <w:rPr>
+          <w:color w:val="999999"/>
+        </w:rPr>
+        <w:t>____________________________________________________________________________________________________</w:t>
+      </w:r>
+    </w:p>
+    <w:p>
       <w:r>
         <w:br w:type="page"/>
       </w:r>
@@ -4303,6 +4831,94 @@
       </w:r>
     </w:p>
     <w:p>
+      <w:pPr>
+        <w:spacing w:after="190"/>
+      </w:pPr>
+      <w:r>
+        <w:rPr>
+          <w:color w:val="999999"/>
+        </w:rPr>
+        <w:t>____________________________________________________________________________________________________</w:t>
+      </w:r>
+    </w:p>
+    <w:p>
+      <w:pPr>
+        <w:spacing w:after="190"/>
+      </w:pPr>
+      <w:r>
+        <w:rPr>
+          <w:color w:val="999999"/>
+        </w:rPr>
+        <w:t>____________________________________________________________________________________________________</w:t>
+      </w:r>
+    </w:p>
+    <w:p>
+      <w:pPr>
+        <w:spacing w:after="190"/>
+      </w:pPr>
+      <w:r>
+        <w:rPr>
+          <w:color w:val="999999"/>
+        </w:rPr>
+        <w:t>____________________________________________________________________________________________________</w:t>
+      </w:r>
+    </w:p>
+    <w:p>
+      <w:pPr>
+        <w:spacing w:after="190"/>
+      </w:pPr>
+      <w:r>
+        <w:rPr>
+          <w:color w:val="999999"/>
+        </w:rPr>
+        <w:t>____________________________________________________________________________________________________</w:t>
+      </w:r>
+    </w:p>
+    <w:p>
+      <w:pPr>
+        <w:spacing w:after="190"/>
+      </w:pPr>
+      <w:r>
+        <w:rPr>
+          <w:color w:val="999999"/>
+        </w:rPr>
+        <w:t>____________________________________________________________________________________________________</w:t>
+      </w:r>
+    </w:p>
+    <w:p>
+      <w:pPr>
+        <w:spacing w:after="190"/>
+      </w:pPr>
+      <w:r>
+        <w:rPr>
+          <w:color w:val="999999"/>
+        </w:rPr>
+        <w:t>____________________________________________________________________________________________________</w:t>
+      </w:r>
+    </w:p>
+    <w:p>
+      <w:pPr>
+        <w:spacing w:after="190"/>
+      </w:pPr>
+      <w:r>
+        <w:rPr>
+          <w:color w:val="999999"/>
+        </w:rPr>
+        <w:t>____________________________________________________________________________________________________</w:t>
+      </w:r>
+    </w:p>
+    <w:p>
+      <w:pPr>
+        <w:spacing w:after="190"/>
+      </w:pPr>
+      <w:r>
+        <w:rPr>
+          <w:color w:val="999999"/>
+        </w:rPr>
+        <w:t>____________________________________________________________________________________________________</w:t>
+      </w:r>
+    </w:p>
+    <w:p>
       <w:r>
         <w:br w:type="page"/>
       </w:r>
@@ -4916,6 +5532,94 @@
       </w:r>
     </w:p>
     <w:p>
+      <w:pPr>
+        <w:spacing w:after="190"/>
+      </w:pPr>
+      <w:r>
+        <w:rPr>
+          <w:color w:val="999999"/>
+        </w:rPr>
+        <w:t>____________________________________________________________________________________________________</w:t>
+      </w:r>
+    </w:p>
+    <w:p>
+      <w:pPr>
+        <w:spacing w:after="190"/>
+      </w:pPr>
+      <w:r>
+        <w:rPr>
+          <w:color w:val="999999"/>
+        </w:rPr>
+        <w:t>____________________________________________________________________________________________________</w:t>
+      </w:r>
+    </w:p>
+    <w:p>
+      <w:pPr>
+        <w:spacing w:after="190"/>
+      </w:pPr>
+      <w:r>
+        <w:rPr>
+          <w:color w:val="999999"/>
+        </w:rPr>
+        <w:t>____________________________________________________________________________________________________</w:t>
+      </w:r>
+    </w:p>
+    <w:p>
+      <w:pPr>
+        <w:spacing w:after="190"/>
+      </w:pPr>
+      <w:r>
+        <w:rPr>
+          <w:color w:val="999999"/>
+        </w:rPr>
+        <w:t>____________________________________________________________________________________________________</w:t>
+      </w:r>
+    </w:p>
+    <w:p>
+      <w:pPr>
+        <w:spacing w:after="190"/>
+      </w:pPr>
+      <w:r>
+        <w:rPr>
+          <w:color w:val="999999"/>
+        </w:rPr>
+        <w:t>____________________________________________________________________________________________________</w:t>
+      </w:r>
+    </w:p>
+    <w:p>
+      <w:pPr>
+        <w:spacing w:after="190"/>
+      </w:pPr>
+      <w:r>
+        <w:rPr>
+          <w:color w:val="999999"/>
+        </w:rPr>
+        <w:t>____________________________________________________________________________________________________</w:t>
+      </w:r>
+    </w:p>
+    <w:p>
+      <w:pPr>
+        <w:spacing w:after="190"/>
+      </w:pPr>
+      <w:r>
+        <w:rPr>
+          <w:color w:val="999999"/>
+        </w:rPr>
+        <w:t>____________________________________________________________________________________________________</w:t>
+      </w:r>
+    </w:p>
+    <w:p>
+      <w:pPr>
+        <w:spacing w:after="190"/>
+      </w:pPr>
+      <w:r>
+        <w:rPr>
+          <w:color w:val="999999"/>
+        </w:rPr>
+        <w:t>____________________________________________________________________________________________________</w:t>
+      </w:r>
+    </w:p>
+    <w:p>
       <w:r>
         <w:br w:type="page"/>
       </w:r>
@@ -5544,6 +6248,94 @@
       </w:r>
     </w:p>
     <w:p>
+      <w:pPr>
+        <w:spacing w:after="190"/>
+      </w:pPr>
+      <w:r>
+        <w:rPr>
+          <w:color w:val="999999"/>
+        </w:rPr>
+        <w:t>____________________________________________________________________________________________________</w:t>
+      </w:r>
+    </w:p>
+    <w:p>
+      <w:pPr>
+        <w:spacing w:after="190"/>
+      </w:pPr>
+      <w:r>
+        <w:rPr>
+          <w:color w:val="999999"/>
+        </w:rPr>
+        <w:t>____________________________________________________________________________________________________</w:t>
+      </w:r>
+    </w:p>
+    <w:p>
+      <w:pPr>
+        <w:spacing w:after="190"/>
+      </w:pPr>
+      <w:r>
+        <w:rPr>
+          <w:color w:val="999999"/>
+        </w:rPr>
+        <w:t>____________________________________________________________________________________________________</w:t>
+      </w:r>
+    </w:p>
+    <w:p>
+      <w:pPr>
+        <w:spacing w:after="190"/>
+      </w:pPr>
+      <w:r>
+        <w:rPr>
+          <w:color w:val="999999"/>
+        </w:rPr>
+        <w:t>____________________________________________________________________________________________________</w:t>
+      </w:r>
+    </w:p>
+    <w:p>
+      <w:pPr>
+        <w:spacing w:after="190"/>
+      </w:pPr>
+      <w:r>
+        <w:rPr>
+          <w:color w:val="999999"/>
+        </w:rPr>
+        <w:t>____________________________________________________________________________________________________</w:t>
+      </w:r>
+    </w:p>
+    <w:p>
+      <w:pPr>
+        <w:spacing w:after="190"/>
+      </w:pPr>
+      <w:r>
+        <w:rPr>
+          <w:color w:val="999999"/>
+        </w:rPr>
+        <w:t>____________________________________________________________________________________________________</w:t>
+      </w:r>
+    </w:p>
+    <w:p>
+      <w:pPr>
+        <w:spacing w:after="190"/>
+      </w:pPr>
+      <w:r>
+        <w:rPr>
+          <w:color w:val="999999"/>
+        </w:rPr>
+        <w:t>____________________________________________________________________________________________________</w:t>
+      </w:r>
+    </w:p>
+    <w:p>
+      <w:pPr>
+        <w:spacing w:after="190"/>
+      </w:pPr>
+      <w:r>
+        <w:rPr>
+          <w:color w:val="999999"/>
+        </w:rPr>
+        <w:t>____________________________________________________________________________________________________</w:t>
+      </w:r>
+    </w:p>
+    <w:p>
       <w:r>
         <w:br w:type="page"/>
       </w:r>
@@ -6172,6 +6964,94 @@
       </w:r>
     </w:p>
     <w:p>
+      <w:pPr>
+        <w:spacing w:after="190"/>
+      </w:pPr>
+      <w:r>
+        <w:rPr>
+          <w:color w:val="999999"/>
+        </w:rPr>
+        <w:t>____________________________________________________________________________________________________</w:t>
+      </w:r>
+    </w:p>
+    <w:p>
+      <w:pPr>
+        <w:spacing w:after="190"/>
+      </w:pPr>
+      <w:r>
+        <w:rPr>
+          <w:color w:val="999999"/>
+        </w:rPr>
+        <w:t>____________________________________________________________________________________________________</w:t>
+      </w:r>
+    </w:p>
+    <w:p>
+      <w:pPr>
+        <w:spacing w:after="190"/>
+      </w:pPr>
+      <w:r>
+        <w:rPr>
+          <w:color w:val="999999"/>
+        </w:rPr>
+        <w:t>____________________________________________________________________________________________________</w:t>
+      </w:r>
+    </w:p>
+    <w:p>
+      <w:pPr>
+        <w:spacing w:after="190"/>
+      </w:pPr>
+      <w:r>
+        <w:rPr>
+          <w:color w:val="999999"/>
+        </w:rPr>
+        <w:t>____________________________________________________________________________________________________</w:t>
+      </w:r>
+    </w:p>
+    <w:p>
+      <w:pPr>
+        <w:spacing w:after="190"/>
+      </w:pPr>
+      <w:r>
+        <w:rPr>
+          <w:color w:val="999999"/>
+        </w:rPr>
+        <w:t>____________________________________________________________________________________________________</w:t>
+      </w:r>
+    </w:p>
+    <w:p>
+      <w:pPr>
+        <w:spacing w:after="190"/>
+      </w:pPr>
+      <w:r>
+        <w:rPr>
+          <w:color w:val="999999"/>
+        </w:rPr>
+        <w:t>____________________________________________________________________________________________________</w:t>
+      </w:r>
+    </w:p>
+    <w:p>
+      <w:pPr>
+        <w:spacing w:after="190"/>
+      </w:pPr>
+      <w:r>
+        <w:rPr>
+          <w:color w:val="999999"/>
+        </w:rPr>
+        <w:t>____________________________________________________________________________________________________</w:t>
+      </w:r>
+    </w:p>
+    <w:p>
+      <w:pPr>
+        <w:spacing w:after="190"/>
+      </w:pPr>
+      <w:r>
+        <w:rPr>
+          <w:color w:val="999999"/>
+        </w:rPr>
+        <w:t>____________________________________________________________________________________________________</w:t>
+      </w:r>
+    </w:p>
+    <w:p>
       <w:r>
         <w:br w:type="page"/>
       </w:r>
@@ -6800,6 +7680,94 @@
       </w:r>
     </w:p>
     <w:p>
+      <w:pPr>
+        <w:spacing w:after="190"/>
+      </w:pPr>
+      <w:r>
+        <w:rPr>
+          <w:color w:val="999999"/>
+        </w:rPr>
+        <w:t>____________________________________________________________________________________________________</w:t>
+      </w:r>
+    </w:p>
+    <w:p>
+      <w:pPr>
+        <w:spacing w:after="190"/>
+      </w:pPr>
+      <w:r>
+        <w:rPr>
+          <w:color w:val="999999"/>
+        </w:rPr>
+        <w:t>____________________________________________________________________________________________________</w:t>
+      </w:r>
+    </w:p>
+    <w:p>
+      <w:pPr>
+        <w:spacing w:after="190"/>
+      </w:pPr>
+      <w:r>
+        <w:rPr>
+          <w:color w:val="999999"/>
+        </w:rPr>
+        <w:t>____________________________________________________________________________________________________</w:t>
+      </w:r>
+    </w:p>
+    <w:p>
+      <w:pPr>
+        <w:spacing w:after="190"/>
+      </w:pPr>
+      <w:r>
+        <w:rPr>
+          <w:color w:val="999999"/>
+        </w:rPr>
+        <w:t>____________________________________________________________________________________________________</w:t>
+      </w:r>
+    </w:p>
+    <w:p>
+      <w:pPr>
+        <w:spacing w:after="190"/>
+      </w:pPr>
+      <w:r>
+        <w:rPr>
+          <w:color w:val="999999"/>
+        </w:rPr>
+        <w:t>____________________________________________________________________________________________________</w:t>
+      </w:r>
+    </w:p>
+    <w:p>
+      <w:pPr>
+        <w:spacing w:after="190"/>
+      </w:pPr>
+      <w:r>
+        <w:rPr>
+          <w:color w:val="999999"/>
+        </w:rPr>
+        <w:t>____________________________________________________________________________________________________</w:t>
+      </w:r>
+    </w:p>
+    <w:p>
+      <w:pPr>
+        <w:spacing w:after="190"/>
+      </w:pPr>
+      <w:r>
+        <w:rPr>
+          <w:color w:val="999999"/>
+        </w:rPr>
+        <w:t>____________________________________________________________________________________________________</w:t>
+      </w:r>
+    </w:p>
+    <w:p>
+      <w:pPr>
+        <w:spacing w:after="190"/>
+      </w:pPr>
+      <w:r>
+        <w:rPr>
+          <w:color w:val="999999"/>
+        </w:rPr>
+        <w:t>____________________________________________________________________________________________________</w:t>
+      </w:r>
+    </w:p>
+    <w:p>
       <w:r>
         <w:br w:type="page"/>
       </w:r>
@@ -7428,6 +8396,94 @@
       </w:r>
     </w:p>
     <w:p>
+      <w:pPr>
+        <w:spacing w:after="190"/>
+      </w:pPr>
+      <w:r>
+        <w:rPr>
+          <w:color w:val="999999"/>
+        </w:rPr>
+        <w:t>____________________________________________________________________________________________________</w:t>
+      </w:r>
+    </w:p>
+    <w:p>
+      <w:pPr>
+        <w:spacing w:after="190"/>
+      </w:pPr>
+      <w:r>
+        <w:rPr>
+          <w:color w:val="999999"/>
+        </w:rPr>
+        <w:t>____________________________________________________________________________________________________</w:t>
+      </w:r>
+    </w:p>
+    <w:p>
+      <w:pPr>
+        <w:spacing w:after="190"/>
+      </w:pPr>
+      <w:r>
+        <w:rPr>
+          <w:color w:val="999999"/>
+        </w:rPr>
+        <w:t>____________________________________________________________________________________________________</w:t>
+      </w:r>
+    </w:p>
+    <w:p>
+      <w:pPr>
+        <w:spacing w:after="190"/>
+      </w:pPr>
+      <w:r>
+        <w:rPr>
+          <w:color w:val="999999"/>
+        </w:rPr>
+        <w:t>____________________________________________________________________________________________________</w:t>
+      </w:r>
+    </w:p>
+    <w:p>
+      <w:pPr>
+        <w:spacing w:after="190"/>
+      </w:pPr>
+      <w:r>
+        <w:rPr>
+          <w:color w:val="999999"/>
+        </w:rPr>
+        <w:t>____________________________________________________________________________________________________</w:t>
+      </w:r>
+    </w:p>
+    <w:p>
+      <w:pPr>
+        <w:spacing w:after="190"/>
+      </w:pPr>
+      <w:r>
+        <w:rPr>
+          <w:color w:val="999999"/>
+        </w:rPr>
+        <w:t>____________________________________________________________________________________________________</w:t>
+      </w:r>
+    </w:p>
+    <w:p>
+      <w:pPr>
+        <w:spacing w:after="190"/>
+      </w:pPr>
+      <w:r>
+        <w:rPr>
+          <w:color w:val="999999"/>
+        </w:rPr>
+        <w:t>____________________________________________________________________________________________________</w:t>
+      </w:r>
+    </w:p>
+    <w:p>
+      <w:pPr>
+        <w:spacing w:after="190"/>
+      </w:pPr>
+      <w:r>
+        <w:rPr>
+          <w:color w:val="999999"/>
+        </w:rPr>
+        <w:t>____________________________________________________________________________________________________</w:t>
+      </w:r>
+    </w:p>
+    <w:p>
       <w:r>
         <w:br w:type="page"/>
       </w:r>
@@ -8041,6 +9097,94 @@
       </w:r>
     </w:p>
     <w:p>
+      <w:pPr>
+        <w:spacing w:after="190"/>
+      </w:pPr>
+      <w:r>
+        <w:rPr>
+          <w:color w:val="999999"/>
+        </w:rPr>
+        <w:t>____________________________________________________________________________________________________</w:t>
+      </w:r>
+    </w:p>
+    <w:p>
+      <w:pPr>
+        <w:spacing w:after="190"/>
+      </w:pPr>
+      <w:r>
+        <w:rPr>
+          <w:color w:val="999999"/>
+        </w:rPr>
+        <w:t>____________________________________________________________________________________________________</w:t>
+      </w:r>
+    </w:p>
+    <w:p>
+      <w:pPr>
+        <w:spacing w:after="190"/>
+      </w:pPr>
+      <w:r>
+        <w:rPr>
+          <w:color w:val="999999"/>
+        </w:rPr>
+        <w:t>____________________________________________________________________________________________________</w:t>
+      </w:r>
+    </w:p>
+    <w:p>
+      <w:pPr>
+        <w:spacing w:after="190"/>
+      </w:pPr>
+      <w:r>
+        <w:rPr>
+          <w:color w:val="999999"/>
+        </w:rPr>
+        <w:t>____________________________________________________________________________________________________</w:t>
+      </w:r>
+    </w:p>
+    <w:p>
+      <w:pPr>
+        <w:spacing w:after="190"/>
+      </w:pPr>
+      <w:r>
+        <w:rPr>
+          <w:color w:val="999999"/>
+        </w:rPr>
+        <w:t>____________________________________________________________________________________________________</w:t>
+      </w:r>
+    </w:p>
+    <w:p>
+      <w:pPr>
+        <w:spacing w:after="190"/>
+      </w:pPr>
+      <w:r>
+        <w:rPr>
+          <w:color w:val="999999"/>
+        </w:rPr>
+        <w:t>____________________________________________________________________________________________________</w:t>
+      </w:r>
+    </w:p>
+    <w:p>
+      <w:pPr>
+        <w:spacing w:after="190"/>
+      </w:pPr>
+      <w:r>
+        <w:rPr>
+          <w:color w:val="999999"/>
+        </w:rPr>
+        <w:t>____________________________________________________________________________________________________</w:t>
+      </w:r>
+    </w:p>
+    <w:p>
+      <w:pPr>
+        <w:spacing w:after="190"/>
+      </w:pPr>
+      <w:r>
+        <w:rPr>
+          <w:color w:val="999999"/>
+        </w:rPr>
+        <w:t>____________________________________________________________________________________________________</w:t>
+      </w:r>
+    </w:p>
+    <w:p>
       <w:r>
         <w:br w:type="page"/>
       </w:r>
@@ -8654,6 +9798,94 @@
       </w:r>
     </w:p>
     <w:p>
+      <w:pPr>
+        <w:spacing w:after="190"/>
+      </w:pPr>
+      <w:r>
+        <w:rPr>
+          <w:color w:val="999999"/>
+        </w:rPr>
+        <w:t>____________________________________________________________________________________________________</w:t>
+      </w:r>
+    </w:p>
+    <w:p>
+      <w:pPr>
+        <w:spacing w:after="190"/>
+      </w:pPr>
+      <w:r>
+        <w:rPr>
+          <w:color w:val="999999"/>
+        </w:rPr>
+        <w:t>____________________________________________________________________________________________________</w:t>
+      </w:r>
+    </w:p>
+    <w:p>
+      <w:pPr>
+        <w:spacing w:after="190"/>
+      </w:pPr>
+      <w:r>
+        <w:rPr>
+          <w:color w:val="999999"/>
+        </w:rPr>
+        <w:t>____________________________________________________________________________________________________</w:t>
+      </w:r>
+    </w:p>
+    <w:p>
+      <w:pPr>
+        <w:spacing w:after="190"/>
+      </w:pPr>
+      <w:r>
+        <w:rPr>
+          <w:color w:val="999999"/>
+        </w:rPr>
+        <w:t>____________________________________________________________________________________________________</w:t>
+      </w:r>
+    </w:p>
+    <w:p>
+      <w:pPr>
+        <w:spacing w:after="190"/>
+      </w:pPr>
+      <w:r>
+        <w:rPr>
+          <w:color w:val="999999"/>
+        </w:rPr>
+        <w:t>____________________________________________________________________________________________________</w:t>
+      </w:r>
+    </w:p>
+    <w:p>
+      <w:pPr>
+        <w:spacing w:after="190"/>
+      </w:pPr>
+      <w:r>
+        <w:rPr>
+          <w:color w:val="999999"/>
+        </w:rPr>
+        <w:t>____________________________________________________________________________________________________</w:t>
+      </w:r>
+    </w:p>
+    <w:p>
+      <w:pPr>
+        <w:spacing w:after="190"/>
+      </w:pPr>
+      <w:r>
+        <w:rPr>
+          <w:color w:val="999999"/>
+        </w:rPr>
+        <w:t>____________________________________________________________________________________________________</w:t>
+      </w:r>
+    </w:p>
+    <w:p>
+      <w:pPr>
+        <w:spacing w:after="190"/>
+      </w:pPr>
+      <w:r>
+        <w:rPr>
+          <w:color w:val="999999"/>
+        </w:rPr>
+        <w:t>____________________________________________________________________________________________________</w:t>
+      </w:r>
+    </w:p>
+    <w:p>
       <w:r>
         <w:br w:type="page"/>
       </w:r>
@@ -9264,6 +10496,94 @@
       </w:r>
     </w:p>
     <w:p>
+      <w:pPr>
+        <w:spacing w:after="190"/>
+      </w:pPr>
+      <w:r>
+        <w:rPr>
+          <w:color w:val="999999"/>
+        </w:rPr>
+        <w:t>____________________________________________________________________________________________________</w:t>
+      </w:r>
+    </w:p>
+    <w:p>
+      <w:pPr>
+        <w:spacing w:after="190"/>
+      </w:pPr>
+      <w:r>
+        <w:rPr>
+          <w:color w:val="999999"/>
+        </w:rPr>
+        <w:t>____________________________________________________________________________________________________</w:t>
+      </w:r>
+    </w:p>
+    <w:p>
+      <w:pPr>
+        <w:spacing w:after="190"/>
+      </w:pPr>
+      <w:r>
+        <w:rPr>
+          <w:color w:val="999999"/>
+        </w:rPr>
+        <w:t>____________________________________________________________________________________________________</w:t>
+      </w:r>
+    </w:p>
+    <w:p>
+      <w:pPr>
+        <w:spacing w:after="190"/>
+      </w:pPr>
+      <w:r>
+        <w:rPr>
+          <w:color w:val="999999"/>
+        </w:rPr>
+        <w:t>____________________________________________________________________________________________________</w:t>
+      </w:r>
+    </w:p>
+    <w:p>
+      <w:pPr>
+        <w:spacing w:after="190"/>
+      </w:pPr>
+      <w:r>
+        <w:rPr>
+          <w:color w:val="999999"/>
+        </w:rPr>
+        <w:t>____________________________________________________________________________________________________</w:t>
+      </w:r>
+    </w:p>
+    <w:p>
+      <w:pPr>
+        <w:spacing w:after="190"/>
+      </w:pPr>
+      <w:r>
+        <w:rPr>
+          <w:color w:val="999999"/>
+        </w:rPr>
+        <w:t>____________________________________________________________________________________________________</w:t>
+      </w:r>
+    </w:p>
+    <w:p>
+      <w:pPr>
+        <w:spacing w:after="190"/>
+      </w:pPr>
+      <w:r>
+        <w:rPr>
+          <w:color w:val="999999"/>
+        </w:rPr>
+        <w:t>____________________________________________________________________________________________________</w:t>
+      </w:r>
+    </w:p>
+    <w:p>
+      <w:pPr>
+        <w:spacing w:after="190"/>
+      </w:pPr>
+      <w:r>
+        <w:rPr>
+          <w:color w:val="999999"/>
+        </w:rPr>
+        <w:t>____________________________________________________________________________________________________</w:t>
+      </w:r>
+    </w:p>
+    <w:p>
       <w:r>
         <w:br w:type="page"/>
       </w:r>
@@ -9877,6 +11197,94 @@
       </w:r>
     </w:p>
     <w:p>
+      <w:pPr>
+        <w:spacing w:after="190"/>
+      </w:pPr>
+      <w:r>
+        <w:rPr>
+          <w:color w:val="999999"/>
+        </w:rPr>
+        <w:t>____________________________________________________________________________________________________</w:t>
+      </w:r>
+    </w:p>
+    <w:p>
+      <w:pPr>
+        <w:spacing w:after="190"/>
+      </w:pPr>
+      <w:r>
+        <w:rPr>
+          <w:color w:val="999999"/>
+        </w:rPr>
+        <w:t>____________________________________________________________________________________________________</w:t>
+      </w:r>
+    </w:p>
+    <w:p>
+      <w:pPr>
+        <w:spacing w:after="190"/>
+      </w:pPr>
+      <w:r>
+        <w:rPr>
+          <w:color w:val="999999"/>
+        </w:rPr>
+        <w:t>____________________________________________________________________________________________________</w:t>
+      </w:r>
+    </w:p>
+    <w:p>
+      <w:pPr>
+        <w:spacing w:after="190"/>
+      </w:pPr>
+      <w:r>
+        <w:rPr>
+          <w:color w:val="999999"/>
+        </w:rPr>
+        <w:t>____________________________________________________________________________________________________</w:t>
+      </w:r>
+    </w:p>
+    <w:p>
+      <w:pPr>
+        <w:spacing w:after="190"/>
+      </w:pPr>
+      <w:r>
+        <w:rPr>
+          <w:color w:val="999999"/>
+        </w:rPr>
+        <w:t>____________________________________________________________________________________________________</w:t>
+      </w:r>
+    </w:p>
+    <w:p>
+      <w:pPr>
+        <w:spacing w:after="190"/>
+      </w:pPr>
+      <w:r>
+        <w:rPr>
+          <w:color w:val="999999"/>
+        </w:rPr>
+        <w:t>____________________________________________________________________________________________________</w:t>
+      </w:r>
+    </w:p>
+    <w:p>
+      <w:pPr>
+        <w:spacing w:after="190"/>
+      </w:pPr>
+      <w:r>
+        <w:rPr>
+          <w:color w:val="999999"/>
+        </w:rPr>
+        <w:t>____________________________________________________________________________________________________</w:t>
+      </w:r>
+    </w:p>
+    <w:p>
+      <w:pPr>
+        <w:spacing w:after="190"/>
+      </w:pPr>
+      <w:r>
+        <w:rPr>
+          <w:color w:val="999999"/>
+        </w:rPr>
+        <w:t>____________________________________________________________________________________________________</w:t>
+      </w:r>
+    </w:p>
+    <w:p>
       <w:r>
         <w:br w:type="page"/>
       </w:r>
@@ -10490,6 +11898,94 @@
       </w:r>
     </w:p>
     <w:p>
+      <w:pPr>
+        <w:spacing w:after="190"/>
+      </w:pPr>
+      <w:r>
+        <w:rPr>
+          <w:color w:val="999999"/>
+        </w:rPr>
+        <w:t>____________________________________________________________________________________________________</w:t>
+      </w:r>
+    </w:p>
+    <w:p>
+      <w:pPr>
+        <w:spacing w:after="190"/>
+      </w:pPr>
+      <w:r>
+        <w:rPr>
+          <w:color w:val="999999"/>
+        </w:rPr>
+        <w:t>____________________________________________________________________________________________________</w:t>
+      </w:r>
+    </w:p>
+    <w:p>
+      <w:pPr>
+        <w:spacing w:after="190"/>
+      </w:pPr>
+      <w:r>
+        <w:rPr>
+          <w:color w:val="999999"/>
+        </w:rPr>
+        <w:t>____________________________________________________________________________________________________</w:t>
+      </w:r>
+    </w:p>
+    <w:p>
+      <w:pPr>
+        <w:spacing w:after="190"/>
+      </w:pPr>
+      <w:r>
+        <w:rPr>
+          <w:color w:val="999999"/>
+        </w:rPr>
+        <w:t>____________________________________________________________________________________________________</w:t>
+      </w:r>
+    </w:p>
+    <w:p>
+      <w:pPr>
+        <w:spacing w:after="190"/>
+      </w:pPr>
+      <w:r>
+        <w:rPr>
+          <w:color w:val="999999"/>
+        </w:rPr>
+        <w:t>____________________________________________________________________________________________________</w:t>
+      </w:r>
+    </w:p>
+    <w:p>
+      <w:pPr>
+        <w:spacing w:after="190"/>
+      </w:pPr>
+      <w:r>
+        <w:rPr>
+          <w:color w:val="999999"/>
+        </w:rPr>
+        <w:t>____________________________________________________________________________________________________</w:t>
+      </w:r>
+    </w:p>
+    <w:p>
+      <w:pPr>
+        <w:spacing w:after="190"/>
+      </w:pPr>
+      <w:r>
+        <w:rPr>
+          <w:color w:val="999999"/>
+        </w:rPr>
+        <w:t>____________________________________________________________________________________________________</w:t>
+      </w:r>
+    </w:p>
+    <w:p>
+      <w:pPr>
+        <w:spacing w:after="190"/>
+      </w:pPr>
+      <w:r>
+        <w:rPr>
+          <w:color w:val="999999"/>
+        </w:rPr>
+        <w:t>____________________________________________________________________________________________________</w:t>
+      </w:r>
+    </w:p>
+    <w:p>
       <w:r>
         <w:br w:type="page"/>
       </w:r>
@@ -11118,6 +12614,94 @@
       </w:r>
     </w:p>
     <w:p>
+      <w:pPr>
+        <w:spacing w:after="190"/>
+      </w:pPr>
+      <w:r>
+        <w:rPr>
+          <w:color w:val="999999"/>
+        </w:rPr>
+        <w:t>____________________________________________________________________________________________________</w:t>
+      </w:r>
+    </w:p>
+    <w:p>
+      <w:pPr>
+        <w:spacing w:after="190"/>
+      </w:pPr>
+      <w:r>
+        <w:rPr>
+          <w:color w:val="999999"/>
+        </w:rPr>
+        <w:t>____________________________________________________________________________________________________</w:t>
+      </w:r>
+    </w:p>
+    <w:p>
+      <w:pPr>
+        <w:spacing w:after="190"/>
+      </w:pPr>
+      <w:r>
+        <w:rPr>
+          <w:color w:val="999999"/>
+        </w:rPr>
+        <w:t>____________________________________________________________________________________________________</w:t>
+      </w:r>
+    </w:p>
+    <w:p>
+      <w:pPr>
+        <w:spacing w:after="190"/>
+      </w:pPr>
+      <w:r>
+        <w:rPr>
+          <w:color w:val="999999"/>
+        </w:rPr>
+        <w:t>____________________________________________________________________________________________________</w:t>
+      </w:r>
+    </w:p>
+    <w:p>
+      <w:pPr>
+        <w:spacing w:after="190"/>
+      </w:pPr>
+      <w:r>
+        <w:rPr>
+          <w:color w:val="999999"/>
+        </w:rPr>
+        <w:t>____________________________________________________________________________________________________</w:t>
+      </w:r>
+    </w:p>
+    <w:p>
+      <w:pPr>
+        <w:spacing w:after="190"/>
+      </w:pPr>
+      <w:r>
+        <w:rPr>
+          <w:color w:val="999999"/>
+        </w:rPr>
+        <w:t>____________________________________________________________________________________________________</w:t>
+      </w:r>
+    </w:p>
+    <w:p>
+      <w:pPr>
+        <w:spacing w:after="190"/>
+      </w:pPr>
+      <w:r>
+        <w:rPr>
+          <w:color w:val="999999"/>
+        </w:rPr>
+        <w:t>____________________________________________________________________________________________________</w:t>
+      </w:r>
+    </w:p>
+    <w:p>
+      <w:pPr>
+        <w:spacing w:after="190"/>
+      </w:pPr>
+      <w:r>
+        <w:rPr>
+          <w:color w:val="999999"/>
+        </w:rPr>
+        <w:t>____________________________________________________________________________________________________</w:t>
+      </w:r>
+    </w:p>
+    <w:p>
       <w:r>
         <w:br w:type="page"/>
       </w:r>
@@ -11618,6 +13202,94 @@
           <w:szCs w:val="19"/>
         </w:rPr>
         <w:t>Write your script below.</w:t>
+      </w:r>
+    </w:p>
+    <w:p>
+      <w:pPr>
+        <w:spacing w:after="190"/>
+      </w:pPr>
+      <w:r>
+        <w:rPr>
+          <w:color w:val="999999"/>
+        </w:rPr>
+        <w:t>____________________________________________________________________________________________________</w:t>
+      </w:r>
+    </w:p>
+    <w:p>
+      <w:pPr>
+        <w:spacing w:after="190"/>
+      </w:pPr>
+      <w:r>
+        <w:rPr>
+          <w:color w:val="999999"/>
+        </w:rPr>
+        <w:t>____________________________________________________________________________________________________</w:t>
+      </w:r>
+    </w:p>
+    <w:p>
+      <w:pPr>
+        <w:spacing w:after="190"/>
+      </w:pPr>
+      <w:r>
+        <w:rPr>
+          <w:color w:val="999999"/>
+        </w:rPr>
+        <w:t>____________________________________________________________________________________________________</w:t>
+      </w:r>
+    </w:p>
+    <w:p>
+      <w:pPr>
+        <w:spacing w:after="190"/>
+      </w:pPr>
+      <w:r>
+        <w:rPr>
+          <w:color w:val="999999"/>
+        </w:rPr>
+        <w:t>____________________________________________________________________________________________________</w:t>
+      </w:r>
+    </w:p>
+    <w:p>
+      <w:pPr>
+        <w:spacing w:after="190"/>
+      </w:pPr>
+      <w:r>
+        <w:rPr>
+          <w:color w:val="999999"/>
+        </w:rPr>
+        <w:t>____________________________________________________________________________________________________</w:t>
+      </w:r>
+    </w:p>
+    <w:p>
+      <w:pPr>
+        <w:spacing w:after="190"/>
+      </w:pPr>
+      <w:r>
+        <w:rPr>
+          <w:color w:val="999999"/>
+        </w:rPr>
+        <w:t>____________________________________________________________________________________________________</w:t>
+      </w:r>
+    </w:p>
+    <w:p>
+      <w:pPr>
+        <w:spacing w:after="190"/>
+      </w:pPr>
+      <w:r>
+        <w:rPr>
+          <w:color w:val="999999"/>
+        </w:rPr>
+        <w:t>____________________________________________________________________________________________________</w:t>
+      </w:r>
+    </w:p>
+    <w:p>
+      <w:pPr>
+        <w:spacing w:after="190"/>
+      </w:pPr>
+      <w:r>
+        <w:rPr>
+          <w:color w:val="999999"/>
+        </w:rPr>
+        <w:t>____________________________________________________________________________________________________</w:t>
       </w:r>
     </w:p>
     <w:p>

</xml_diff>